<commit_message>
Evaluate EPF across held-out survey years and preserve original figures
Add five-year LOYO comparison, real EPF SHAP and executed main notebook.
Revise the manuscript with actual uncertainty and classification limits.
Retain prior figures in a labelled reference appendix and publish only
current source dependencies and aggregate results.
</commit_message>
<xml_diff>
--- a/paper/manuscript_review.docx
+++ b/paper/manuscript_review.docx
@@ -50,7 +50,7 @@
                 <w:color w:val="000000"/>
                 <w:b/>
               </w:rPr>
-              <w:t xml:space="preserve">청년층 미인지 대사이상의 비침습적 유형 분류를 위한 머신러닝 모델 비교</w:t>
+              <w:t xml:space="preserve">EPF 신경망을 이용한 청년층 대사이상 유형 분류와 생활습관 관련 요인 분석</w:t>
             </w:r>
           </w:p>
         </w:tc>
@@ -84,7 +84,7 @@
                 <w:color w:val="000000"/>
                 <w:b/>
               </w:rPr>
-              <w:t xml:space="preserve">Comparison of Machine Learning Models for Non-Invasive Classification of Unrecognized Metabolic Abnormalities in Young Adults</w:t>
+              <w:t xml:space="preserve">EPF Neural Network for Metabolic Abnormality Classification and Lifestyle Analysis in Young Adults</w:t>
             </w:r>
           </w:p>
         </w:tc>
@@ -162,7 +162,7 @@
                 <w:szCs w:val="19"/>
                 <w:color w:val="000000"/>
               </w:rPr>
-              <w:t xml:space="preserve">혈당·혈압·지질 이상을 하나의 이진 결과로 묶으면 소견의 유형에 따른 분류 난이도가 드러나지 않는다. 본 연구는 국민건강영양조사 2020–2024년 자료에서 기존 진단과 관련 복약이 없는 20–39세 4,508명을 선정하고, 신체계측과 생활습관 등 15개 비침습적 입력으로 정상·혈압 단독·혈당 단독·지질 단독·복합의 다섯 군을 분류하였다. 로지스틱 회귀, 랜덤 포레스트, 두 부스팅 모델, MLP 및 공동분포를 학습하는 세 모델을 같은 대상자와 조사구 단위 교차검증에서 비교하였으며, 직접 구현한 EPF 신경망을 공동분포 비교군에 포함하였다. 조사 가중 macro AP는 LightGBM 0.3515, EPF 0.3515, 로지스틱 회귀 0.3443이었다. EPF와 공동분포 MLP의 차이는 0.0030이었으나 95% 구간이 −0.0024–0.0088로 0을 포함하였다. 정상군보다 단독 혈압·혈당군의 AP가 낮아, 전체 점수만으로 선별 성능을 판단하기 어려웠다. 이 결과는 특정 구조의 우월성보다 대사소견 유형별 평가와 출력 설계를 구분한 비교가 필요함을 보여준다.</w:t>
+              <w:t xml:space="preserve">본 연구는 국민건강영양조사 2020–2024년 청년 4,508명의 15개 비침습적 입력으로 다섯 대사소견군을 분류하는 EPF 신경망을 평가하였다. 복소 상태·사건 추적·가소성 갱신과 다섯 검사값의 공동분포 출력을 결합하고, 관측 검사값은 학습 정답으로만 사용하였다. 한 해를 시험용으로 남기고 나머지 네 해에서 설정 선택과 전체 재학습을 수행하는 검증을 다섯 번 반복하였다. EPF의 평균 시험연도 macro AP는 0.3571로 비교한 8개 조건 중 가장 높았으나 LightGBM 대비 차이 0.0055의 95% 구간은 [−0.0056, 0.0151]로 우수성이 확인되지는 않았다. EPF 자체의 시험 예측 969명에 대한 SHAP에서는 허리둘레·WHtR·연령의 기여가 높고 생활습관 관련 차이가 관찰되었다. 단독 혈압·혈당군의 결정 성능과 관찰자료의 한계를 함께 제시하며, 설명값을 예방 행동의 인과효과로 해석하지 않았다.</w:t>
             </w:r>
           </w:p>
         </w:tc>
@@ -216,7 +216,7 @@
           <w:szCs w:val="19"/>
           <w:color w:val="000000"/>
         </w:rPr>
-        <w:t xml:space="preserve">비침습적 정보로 대사이상 가능성을 가려내는 모델은 혈액검사 이전 단계에서 활용할 수 있지만, 이상 유무만 분류하면 서로 다른 소견이 같은 양성군에 포함된다. 혈당 상승 한 가지가 있는 사람과 혈당·혈압·지질 이상이 함께 있는 사람은 같은 결과로 표현되고, 모델이 어느 유형을 잘 구분했는지도 알기 어렵다. 따라서 조기 선별을 검토하려면 종합 점수와 함께 유형별 분류 성능을 확인해야 한다.</w:t>
+        <w:t xml:space="preserve">청년층 대사이상을 비침습적 정보로 분류하려면 혈당·혈압·지질 소견이 단독으로 나타나는 경우와 함께 나타나는 경우를 구분해야 한다. 한 사람이 여러 소견을 보유할 수 있어 이상 유무만 분류하면 유형에 따른 차이가 가려지고, 학습 자료와 시험 자료가 같은 조사연도에 섞이면 연도 간 변화에 대한 성능도 확인하기 어렵다. 국민건강영양조사는 건강설문·검진·영양조사를 결합한 반복 횡단면 자료이므로 이러한 분류와 조사연도 간 검증을 함께 수행할 수 있다[1].</w:t>
       </w:r>
     </w:p>
     <w:p>
@@ -234,7 +234,7 @@
           <w:szCs w:val="19"/>
           <w:color w:val="000000"/>
         </w:rPr>
-        <w:t xml:space="preserve">국민건강영양조사는 건강설문·검진·영양조사를 결합한 반복 횡단면 자료로, 계측과 생활습관을 검사 결과에 연결해 분석할 수 있다[1]. 본 연구는 2020–2024년의 청년 자료에서 배타적인 다섯 대사소견군을 정의하고, 기존 머신러닝 모델과 직접 구현한 EPF 신경망을 동일한 입력과 표본에서 비교하였다. EPF는 비교 대상 중 하나로 두었으며, 신경망 구조와 연속 검사값을 학습하는 출력 설계의 영향을 혼동하지 않도록 같은 공동분포 출력을 사용하는 MLP와 선형 평균 모델도 포함하였다.</w:t>
+        <w:t xml:space="preserve">본 연구는 EPF(Event Plastic Field) 신경망을 중심으로 청년층 대사이상 유형을 분류하고, 그 예측에 기여하는 생활습관 정보를 분석한다. EPF는 복소 잠재 상태·사건 추적·가소성 상태를 내부 반복에서 갱신하며 검사값의 공동분포를 보정하도록 구성하였다. 기존 분류기와의 성능 비교에 더해 같은 공동분포 출력을 사용하는 신경망을 비교군으로 두었고, 다섯 조사연도를 하나씩 제외해 연도 간 일반화를 평가하였다. 설명 분석에는 EPF 자체의 시험 예측을 사용하였다.</w:t>
       </w:r>
     </w:p>
     <w:p>
@@ -274,7 +274,7 @@
           <w:color w:val="000000"/>
           <w:b/>
         </w:rPr>
-        <w:t xml:space="preserve">2.1 자료와 대상자</w:t>
+        <w:t xml:space="preserve">2.1 대상자와 비침습적 입력</w:t>
       </w:r>
     </w:p>
     <w:p>
@@ -292,7 +292,7 @@
           <w:szCs w:val="19"/>
           <w:color w:val="000000"/>
         </w:rPr>
-        <w:t xml:space="preserve">질병관리청이 공개한 2020–2024년 원시자료를 사용하였다. 고혈압·당뇨·이상지질혈증의 기존 진단이 없고 관련 약물을 복용하지 않는다고 확인된 사람 중, 비임신 상태와 12시간 이상 공복이 확인되고 혈당·수축기 및 이완기 혈압·중성지방(TG)·HDL이 모두 관측된 대상을 남겼다. 검사값이 양수이고 수축기 혈압이 이완기 혈압보다 높으며 조사 설계정보가 유효한 19–39세는 5,229명이었다. 이를 20–39세 5,055명으로 제한한 뒤 영양조사 결합 가중치(wt_tot)가 양수인 4,508명을 분석하였다. 저녁 식사 관련 문항이 영양조사에 속하므로 같은 참여 집단을 모든 모델에 적용하였다.</w:t>
+        <w:t xml:space="preserve">질병관리청 국민건강영양조사 2020–2024년 원시자료에서 20–39세를 대상으로 하였다. 고혈압·당뇨·이상지질혈증 진단과 관련 복약이 없다고 확인되고, 비임신 상태와 12시간 이상 공복, 다섯 검사값의 완전 관측 및 유효 조사설계 조건을 충족한 5,055명 중 영양조사 결합 가중치(wt_tot)가 양수인 4,508명을 포함하였다. 저녁 동반 식사 문항이 영양조사에 속하므로 참여 조건을 모든 모델에 동일하게 적용했다. 진단·복약 상태의 모름과 검사값 결측을 정상으로 코딩하지 않았다. 연도별 인원은 851·792·926·965·974명이었다.</w:t>
       </w:r>
     </w:p>
     <w:p>
@@ -310,7 +310,7 @@
           <w:szCs w:val="19"/>
           <w:color w:val="000000"/>
         </w:rPr>
-        <w:t xml:space="preserve">연도별 인원은 2020년 851명, 2021년 792명, 2022년 926명, 2023년 965명, 2024년 974명이었다. 진단·복약·임신 상태의 모름과 정답 검사값의 결측은 정상으로 처리하지 않았다. 여기서 미인지는 진단과 관련 복약이 없다는 조작적 정의이며, 본인이 검사 결과를 전혀 알지 못한다는 사실까지 확인한 것은 아니다.</w:t>
+        <w:t xml:space="preserve">예측 입력은 연령·성별·소득·교육, BMI·허리둘레·허리둘레/키 비율(WHtR), 현재흡연·월간음주·유산소 활동·1인가구 여부, 좌식시간·저녁 혼밥·최근 1년 체중 증가·취침 전 칫솔질 미실시의 15개다. 1인가구는 가구원 수 1명으로 정의하였다. 체중 증가는 BO1_1=3, 저녁 혼밥은 L_DN_TO=2로 코딩하고 비해당 응답은 별도 범주로 보존했다. 수치형의 조사 가중 평균·표준편차와 범주형 인코딩은 각 학습 부분에서 적합했으며 결측 지시자를 포함해 45열로 변환하였다. 식별자·조사연도·검사값·진단·복약 문항은 예측 입력에 넣지 않았다.</w:t>
       </w:r>
     </w:p>
     <w:p>
@@ -330,7 +330,7 @@
           <w:color w:val="000000"/>
           <w:b/>
         </w:rPr>
-        <w:t xml:space="preserve">2.2 목표변수와 비침습적 입력</w:t>
+        <w:t xml:space="preserve">2.2 목표변수</w:t>
       </w:r>
     </w:p>
     <w:p>
@@ -348,25 +348,63 @@
           <w:szCs w:val="19"/>
           <w:color w:val="000000"/>
         </w:rPr>
-        <w:t xml:space="preserve">대사증후군 구성요소의 절단값을 참고해 혈당≥100 mg/dL, 수축기 혈압≥130 mmHg 또는 이완기 혈압≥85 mmHg, TG≥150 mg/dL, HDL&lt;40 mg/dL(남성) 또는 &lt;50 mg/dL(여성)를 각각 양성 소견으로 정의하였다[2]. TG와 저HDL을 하나의 지질 영역으로 묶어 혈당·혈압·지질 세 영역을 세었고, 표 1처럼 배타적인 다섯 군으로 구성하였다. TG와 저HDL만 함께 이상인 경우도 지질 단독에 속한다. 이 라벨은 검사 소견을 나타내며 질환 확진이나 대사증후군 진단과 같지 않다.</w:t>
-      </w:r>
-    </w:p>
-    <w:p>
-      <w:pPr>
-        <w:widowControl/>
+        <w:t xml:space="preserve">혈당≥100 mg/dL, 수축기 혈압≥130 mmHg 또는 이완기 혈압≥85 mmHg, TG≥150 mg/dL, HDL&lt;40 mg/dL(남성) 또는 &lt;50 mg/dL(여성)을 네 양성 소견으로 정의하였다[2]. TG와 저HDL을 하나의 지질 영역으로 묶고 혈당·혈압·지질의 세 영역 수에 따라 표 1의 배타적 다섯 군을 구성하였다. TG와 저HDL만 함께 이상인 경우는 지질 단독이다. 이 라벨은 측정 당시 검사 소견의 유형이며 질환 확진이나 미래 발병을 뜻하지 않는다.</w:t>
+      </w:r>
+    </w:p>
+    <w:p>
+      <w:pPr>
+        <w:widowControl/>
+        <w:snapToGrid w:val="0"/>
+        <w:jc w:val="center"/>
+        <w:spacing w:before="0" w:after="35" w:line="234" w:lineRule="exact"/>
+        <w:ind w:firstLine="180"/>
+      </w:pPr>
+      <w:r>
+        <w:rPr>
+          <w:rFonts w:ascii="Arial" w:hAnsi="Arial" w:eastAsia="맑은 고딕" w:cs="Arial"/>
+          <w:sz w:val="19"/>
+          <w:szCs w:val="19"/>
+          <w:color w:val="000000"/>
+        </w:rPr>
+        <w:t xml:space="preserve">(표1)</w:t>
+      </w:r>
+    </w:p>
+    <w:p>
+      <w:pPr>
+        <w:widowControl/>
+        <w:snapToGrid w:val="0"/>
+        <w:jc w:val="center"/>
+        <w:spacing w:before="0" w:after="35" w:line="234" w:lineRule="exact"/>
+        <w:ind w:firstLine="180"/>
+      </w:pPr>
+      <w:r>
+        <w:rPr>
+          <w:rFonts w:ascii="Arial" w:hAnsi="Arial" w:eastAsia="맑은 고딕" w:cs="Arial"/>
+          <w:sz w:val="19"/>
+          <w:szCs w:val="19"/>
+          <w:color w:val="000000"/>
+        </w:rPr>
+        <w:t xml:space="preserve">(그림1)</w:t>
+      </w:r>
+    </w:p>
+    <w:p>
+      <w:pPr>
+        <w:widowControl/>
+        <w:keepNext/>
         <w:keepLines/>
         <w:snapToGrid w:val="0"/>
-        <w:jc w:val="center"/>
-        <w:spacing w:before="25" w:after="55" w:line="218" w:lineRule="atLeast"/>
-      </w:pPr>
-      <w:r>
-        <w:rPr>
-          <w:rFonts w:ascii="Arial" w:hAnsi="Arial" w:eastAsia="맑은 고딕" w:cs="Arial"/>
-          <w:sz w:val="19"/>
-          <w:szCs w:val="19"/>
-          <w:color w:val="000000"/>
-        </w:rPr>
-        <w:t xml:space="preserve">(표1)</w:t>
+        <w:jc w:val="left"/>
+        <w:spacing w:before="65" w:after="30" w:line="246" w:lineRule="atLeast"/>
+      </w:pPr>
+      <w:r>
+        <w:rPr>
+          <w:rFonts w:ascii="Arial" w:hAnsi="Arial" w:eastAsia="맑은 고딕" w:cs="Arial"/>
+          <w:sz w:val="19"/>
+          <w:szCs w:val="19"/>
+          <w:color w:val="000000"/>
+          <w:b/>
+        </w:rPr>
+        <w:t xml:space="preserve">2.3 EPF 구조와 검사값 학습 정답</w:t>
       </w:r>
     </w:p>
     <w:p>
@@ -384,7 +422,7 @@
           <w:szCs w:val="19"/>
           <w:color w:val="000000"/>
         </w:rPr>
-        <w:t xml:space="preserve">원자료에서 선택한 29개 열에는 검사값과 대상자 선별 문항이 포함되므로, 실제 예측 입력은 15개였다. 연령·성별·소득·교육, BMI·허리둘레·허리둘레/키 비율(WHtR), 현재흡연·월간음주·유산소 활동·1인가구 여부에 좌식시간·저녁 혼밥·최근 1년 체중 증가·취침 전 칫솔질 미실시를 더했다. 1인가구는 가구원 수 1명으로 정의했으며 실제 자취 여부를 직접 측정한 변수로 해석하지 않았다.</w:t>
+        <w:t xml:space="preserve">EPF의 입력 X는 위의 15개 비침습적 변수이며, 관측 혈당·혈압·TG·HDL은 입력이 아닌 학습 정답 Y로만 사용한다. 학습 정답은 log 혈당, log 이완기 혈압, log(수축기−이완기 혈압), log TG, log HDL의 다섯 연속값이다. 수축기 혈압은 이완기 혈압과 두 혈압의 차이로 표현하므로 하나의 불명확한 “log 혈압”으로 묶지 않았다. 로그 변환과 표준화의 통계도 학습 자료에서 구하였다.</w:t>
       </w:r>
     </w:p>
     <w:p>
@@ -402,45 +440,7 @@
           <w:szCs w:val="19"/>
           <w:color w:val="000000"/>
         </w:rPr>
-        <w:t xml:space="preserve">코드북에 따라 체중 변화는 BO1_1의 3을 증가로, 저녁 동반 식사는 L_DN_TO의 2를 혼밥으로 코딩하였다. 저녁 식사 빈도에 따른 비해당 응답은 별도 범주로 보존했다. 수치형 표준화의 가중 평균과 표준편차는 학습 부분에서만 구했고, 결측 지시자와 범주형 인코딩을 포함해 45열로 변환하였다. 검사값·진단·복약·개인 식별자는 추론 입력에 넣지 않았다.</w:t>
-      </w:r>
-    </w:p>
-    <w:p>
-      <w:pPr>
-        <w:widowControl/>
-        <w:keepLines/>
-        <w:snapToGrid w:val="0"/>
-        <w:jc w:val="center"/>
-        <w:spacing w:before="25" w:after="55" w:line="218" w:lineRule="atLeast"/>
-      </w:pPr>
-      <w:r>
-        <w:rPr>
-          <w:rFonts w:ascii="Arial" w:hAnsi="Arial" w:eastAsia="맑은 고딕" w:cs="Arial"/>
-          <w:sz w:val="19"/>
-          <w:szCs w:val="19"/>
-          <w:color w:val="000000"/>
-        </w:rPr>
-        <w:t xml:space="preserve">(그림1)</w:t>
-      </w:r>
-    </w:p>
-    <w:p>
-      <w:pPr>
-        <w:widowControl/>
-        <w:keepNext/>
-        <w:keepLines/>
-        <w:snapToGrid w:val="0"/>
-        <w:jc w:val="left"/>
-        <w:spacing w:before="65" w:after="30" w:line="246" w:lineRule="atLeast"/>
-      </w:pPr>
-      <w:r>
-        <w:rPr>
-          <w:rFonts w:ascii="Arial" w:hAnsi="Arial" w:eastAsia="맑은 고딕" w:cs="Arial"/>
-          <w:sz w:val="19"/>
-          <w:szCs w:val="19"/>
-          <w:color w:val="000000"/>
-          <w:b/>
-        </w:rPr>
-        <w:t xml:space="preserve">2.3 비교 모델과 공동분포 출력</w:t>
+        <w:t xml:space="preserve">EPF는 45열 입력을 12차원 복소 상태 z로 투영하고, 사건 추적 r 및 반대칭 가소성 행렬 P와 함께 네 번 갱신한다. 상태 전파와 입력 구동 뒤의 크기 제곱은 사건 발생과 상태 재설정에 사용되며, 사건과 추적 상태의 순서 차이가 P 갱신에 반영된다. 이 계산은 한 사람의 입력을 처리하는 내부 반복으로, 사람을 시간에 따라 추적하거나 생리 상태를 직접 측정하는 과정은 아니다.</w:t>
       </w:r>
     </w:p>
     <w:p>
@@ -458,7 +458,7 @@
           <w:szCs w:val="19"/>
           <w:color w:val="000000"/>
         </w:rPr>
-        <w:t xml:space="preserve">직접 분류군은 다항 로지스틱 회귀(LR), 랜덤 포레스트(RF)[3], XGBoost(XGB)[4], LightGBM(LGBM)[5], MLP로 구성하였다. 공동분포군은 선형 평균 모델(jLinear), MLP(jMLP), EPF(jEPF)로 구성했으며, j는 공동분포 출력을 뜻한다. 공동분포군은 log 혈당, log 이완기 혈압, log(수축기−이완기 혈압), log TG, log HDL의 조건부 정규분포를 학습한다. 공분산은 대각 성분과 rank-one 성분의 합으로 나타내고, 학습 자료로 구한 Ridge 평균 앵커를 사용하였다.</w:t>
+        <w:t xml:space="preserve">상태의 실수·허수·크기·추적·에너지 요약은 평균 보정에 연결하고, P의 네 투영값은 공동분포의 rank-one 적재량에 연결하였다. 연령·체형·성별 맥락은 대각 분산 보정에 사용한다. 평균은 학습 자료의 Ridge 앵커와 신경망 보정량의 합으로, 공분산은 양의 대각 성분과 rank-one 성분의 합으로 구성하였다. 추론에서는 비침습 입력만으로 다섯 검사값의 조건부 분포를 예측하고, 절단값을 적용한 네 소견의 16조합 확률을 적분한 뒤 다섯 군 확률로 합산한다(그림 2).</w:t>
       </w:r>
     </w:p>
     <w:p>
@@ -476,7 +476,45 @@
           <w:szCs w:val="19"/>
           <w:color w:val="000000"/>
         </w:rPr>
-        <w:t xml:space="preserve">학습된 분포에서 네 소견의 16개 조합 확률을 계산한 뒤, 표 1의 다섯 군 확률로 합산하였다. 연속 검사값은 학습 정답으로만 사용하며 추론 시에는 비침습적 입력만 필요하다. 직접 분류군이 다섯 군 라벨을 학습하는 것과 달리 공동분포군은 검사값의 연속 정보도 이용하므로, 두 군 사이의 차이를 신경망 구조만의 효과로 볼 수는 없다.</w:t>
+        <w:t xml:space="preserve">공동분포 신경망은 조사 가중 가우시안 음의 로그우도(NLL)에 공분산 보정 페널티를 더해 학습했고, 직접 MLP는 가중 교차엔트로피를 사용하였다. EPF·MLP의 선형 skip 경로에는 AdamW 학습률의 0.1배를 적용하였다. 내부 검증의 교차엔트로피 또는 NLL로 epoch를 선택하고, 후보 설정끼리는 검증 macro AP로 비교하였다. 네 개발연도 전체의 재학습에는 선택된 epoch와 학습률 경로를 적용하였다.</w:t>
+      </w:r>
+    </w:p>
+    <w:p>
+      <w:pPr>
+        <w:widowControl/>
+        <w:snapToGrid w:val="0"/>
+        <w:jc w:val="center"/>
+        <w:spacing w:before="0" w:after="35" w:line="234" w:lineRule="exact"/>
+        <w:ind w:firstLine="180"/>
+      </w:pPr>
+      <w:r>
+        <w:rPr>
+          <w:rFonts w:ascii="Arial" w:hAnsi="Arial" w:eastAsia="맑은 고딕" w:cs="Arial"/>
+          <w:sz w:val="19"/>
+          <w:szCs w:val="19"/>
+          <w:color w:val="000000"/>
+        </w:rPr>
+        <w:t xml:space="preserve">(그림2)</w:t>
+      </w:r>
+    </w:p>
+    <w:p>
+      <w:pPr>
+        <w:widowControl/>
+        <w:keepNext/>
+        <w:keepLines/>
+        <w:snapToGrid w:val="0"/>
+        <w:jc w:val="left"/>
+        <w:spacing w:before="65" w:after="30" w:line="246" w:lineRule="atLeast"/>
+      </w:pPr>
+      <w:r>
+        <w:rPr>
+          <w:rFonts w:ascii="Arial" w:hAnsi="Arial" w:eastAsia="맑은 고딕" w:cs="Arial"/>
+          <w:sz w:val="19"/>
+          <w:szCs w:val="19"/>
+          <w:color w:val="000000"/>
+          <w:b/>
+        </w:rPr>
+        <w:t xml:space="preserve">2.4 비교 모델과 연도 단위 평가</w:t>
       </w:r>
     </w:p>
     <w:p>
@@ -494,27 +532,7 @@
           <w:szCs w:val="19"/>
           <w:color w:val="000000"/>
         </w:rPr>
-        <w:t xml:space="preserve">EPF는 12차원 복소 상태, 사건 추적 상태, 반대칭 가소성 행렬을 네 번의 내부 반복에서 함께 갱신하는 구현을 사용하였다. 상태 요약은 검사값의 평균 보정에, 가소성 행렬의 네 투영값은 공분산 보정에 연결하였다. 이는 한 사람의 입력을 처리하는 내부 계산이며 실제 시간에 따른 건강 변화를 추적하는 시계열 모델은 아니다. 평균·공분산이라는 같은 출력 형식을 jMLP와 jLinear에도 적용하여 비교했다. 내부 상태를 실제 생리 기전으로 해석하지는 않았다.</w:t>
-      </w:r>
-    </w:p>
-    <w:p>
-      <w:pPr>
-        <w:widowControl/>
-        <w:keepNext/>
-        <w:keepLines/>
-        <w:snapToGrid w:val="0"/>
-        <w:jc w:val="left"/>
-        <w:spacing w:before="65" w:after="30" w:line="246" w:lineRule="atLeast"/>
-      </w:pPr>
-      <w:r>
-        <w:rPr>
-          <w:rFonts w:ascii="Arial" w:hAnsi="Arial" w:eastAsia="맑은 고딕" w:cs="Arial"/>
-          <w:sz w:val="19"/>
-          <w:szCs w:val="19"/>
-          <w:color w:val="000000"/>
-          <w:b/>
-        </w:rPr>
-        <w:t xml:space="preserve">2.4 학습과 평가</w:t>
+        <w:t xml:space="preserve">비교군은 다항 로지스틱 회귀(LR), 랜덤 포레스트(RF)[3], XGBoost(XGB)[4], LightGBM(LGBM)[5], 직접 MLP, 공동분포 MLP(jMLP), 공동분포 선형 평균 모델(jLinear)이다. j는 공동분포 출력을 뜻하며 EPF 구조의 이름과 구분하였다. 직접 분류기는 다섯 군 라벨을, 공동분포군은 다섯 연속 검사값을 학습하므로 직접 분류기와의 차이를 구조만의 효과로 해석하지 않는다.</w:t>
       </w:r>
     </w:p>
     <w:p>
@@ -532,7 +550,7 @@
           <w:szCs w:val="19"/>
           <w:color w:val="000000"/>
         </w:rPr>
-        <w:t xml:space="preserve">연도별 균형을 고려해 조사구(PSU)를 다섯 외부 fold로 나누었고, 외부 학습 부분은 다시 PSU 기준 80% 학습·20% 검증으로 나누었다. 같은 조사구와 가구가 역할 사이에 겹치지 않도록 확인하였다. 모델별 후보 설정 8개를 seed 42에서 평가해 검증 macro AP로 선택했으며, LR을 제외한 최종 예측은 seed 42–44의 확률 평균을 사용했다. 모든 사람은 외부 평가에 한 번씩 포함되어 out-of-fold(OOF) 예측을 얻었다. 직접 신경망은 교차엔트로피, 공동분포 신경망은 Gaussian NLL로 학습·중단하되 후보 선택 지표는 통일하였다.</w:t>
+        <w:t xml:space="preserve">2020–2024년 중 한 해씩을 시험용으로 제외해 다섯 회 평가했다. 나머지 네 해 안에서 조사구(PSU) 기준 80% 학습·20% 검증으로 설정을 선택했으며, 이후 네 해 전체로 전처리·앵커와 모델을 다시 적합했다. 모든 모델에 같은 대상자·분할·입력을 적용하고 모델별 후보 8개를 seed42에서 검증 macro AP로 선택하였다. 최종 예측은 LR의 결정론적 적합 또는 seed42–44 확률 평균이다. 재학습 시 나무 수나 신경망 학습 epoch 및 학습률 경로를 내부 검증 결과로 고정하고 시험 자료를 선택에 사용하지 않았다.</w:t>
       </w:r>
     </w:p>
     <w:p>
@@ -550,7 +568,27 @@
           <w:szCs w:val="19"/>
           <w:color w:val="000000"/>
         </w:rPr>
-        <w:t xml:space="preserve">주 지표는 다섯 군 각각을 나머지와 구분하는 조사 가중 average precision(AP)의 산술평균이다. 클래스 불균형에서 양성 예측의 정확도와 재현율을 함께 살피기 위해 AP를 사용했고[6], macro AUROC·macro F1·NLL·Brier를 보조 지표로 계산하였다. F1은 최대 확률의 군을 선택해 구했다. wt_tot을 학습 부분의 평균이 1이 되도록 정규화했으며, 평가는 원래 조사 가중치를 적용했다.</w:t>
+        <w:t xml:space="preserve">주 지표는 각 시험연도에서 다섯 군을 각각 나머지와 구분하는 조사 가중 average precision(AP)을 평균한 뒤, 다섯 시험연도 점수를 산술평균한 값이다[6]. 전체 OOF 예측을 합친 AP, AUROC·F1·NLL·Brier를 보조 지표로 구했다. 조사 가중치 wt_tot을 적용하고, 연도·층 안에서 전체 조사 PSU를 Rao–Wu 방식으로 2,000회 재표집하였다[7]. 구간은 적합된 모델을 고정한 조건부 구간이며 재학습 불확실성을 포함하지 않는다. 주대조는 EPF−LGBM으로 두고 다른 대비는 보조 분석으로 구분했다.</w:t>
+      </w:r>
+    </w:p>
+    <w:p>
+      <w:pPr>
+        <w:widowControl/>
+        <w:keepNext/>
+        <w:keepLines/>
+        <w:snapToGrid w:val="0"/>
+        <w:jc w:val="left"/>
+        <w:spacing w:before="65" w:after="30" w:line="246" w:lineRule="atLeast"/>
+      </w:pPr>
+      <w:r>
+        <w:rPr>
+          <w:rFonts w:ascii="Arial" w:hAnsi="Arial" w:eastAsia="맑은 고딕" w:cs="Arial"/>
+          <w:sz w:val="19"/>
+          <w:szCs w:val="19"/>
+          <w:color w:val="000000"/>
+          <w:b/>
+        </w:rPr>
+        <w:t xml:space="preserve">2.5 EPF 기반 SHAP 설명</w:t>
       </w:r>
     </w:p>
     <w:p>
@@ -568,7 +606,7 @@
           <w:szCs w:val="19"/>
           <w:color w:val="000000"/>
         </w:rPr>
-        <w:t xml:space="preserve">95% 구간은 연도와 층 안에서 전체 조사 PSU를 Rao–Wu 방식으로 2,000회 재표집해 구하였다[7]. 같은 재표집 가중치를 모델 간 차이에도 적용했다. 이 구간은 적합된 모델의 OOF 예측을 고정한 조건부 구간으로, 재학습과 추가 튜닝에 따른 변동은 포함하지 않는다. 사전 지정한 주대조는 jEPF−jMLP의 macro AP이며, 다른 모델과의 차이는 보조 비교로 해석하였다.</w:t>
+        <w:t xml:space="preserve">최종 EPF 앙상블의 다섯 군 확률에 대해 15개 원입력을 순열 기반 SHAP으로 설명하였다[8]. 각 시험연도에서 군별 최대 40명을 무작위 선택한 총 969명에 32쌍의 순·역방향 경로를 적용했고, 배경 표본은 해당 회차의 네 학습연도에서 조사 가중치에 비례해 추출했다. 군별 선택확률의 역수와 조사 가중치를 결합해 중요도를 집계하였다. 경로의 합산 일치와 적분 예측의 기준 계산 일치를 점검했으며, SHAP 패키지의 같은 EPF 함수 설명도 확인하였다. 원입력을 대체한 뒤 인코딩과 신경망·분포 적분을 모두 수행하므로 LightGBM 대리모델의 설명값을 사용하지 않았다.</w:t>
       </w:r>
     </w:p>
     <w:p>
@@ -608,7 +646,7 @@
           <w:color w:val="000000"/>
           <w:b/>
         </w:rPr>
-        <w:t xml:space="preserve">3.1 전체 성능과 모델 간 차이</w:t>
+        <w:t xml:space="preserve">3.1 연도별 분류 성능</w:t>
       </w:r>
     </w:p>
     <w:p>
@@ -626,16 +664,16 @@
           <w:szCs w:val="19"/>
           <w:color w:val="000000"/>
         </w:rPr>
-        <w:t xml:space="preserve">표 2에서 macro AP가 가장 높은 모델은 LGBM(0.3515)이었고 jEPF(0.3515)가 비슷한 값을 보였다. LR은 0.3443, 직접 MLP는 0.3488이었다. 그러나 jEPF−LR 차이 0.0072의 95% 구간은 −0.0041–0.0177이었고, jEPF−LGBM 차이는 −0.00003(−0.0092–0.0100)이었다. 점추정 순위는 관찰되지만 이 결과만으로 jEPF가 기존 모델보다 우수하다고 결론 내릴 근거는 없다(그림 2).</w:t>
-      </w:r>
-    </w:p>
-    <w:p>
-      <w:pPr>
-        <w:widowControl/>
-        <w:keepLines/>
+        <w:t xml:space="preserve">EPF의 평균 시험연도 macro AP는 0.3571로 8개 조건 중 가장 높았고, XGB 0.3544, LGBM 0.3516가 뒤를 이었다(표 2). EPF−LGBM의 차이는 0.0055였으나 95% 구간 [-0.0056, +0.0151]이 0을 포함하였다. EPF는 LGBM보다 3개 시험연도에서 높았으며, 2022·2023년에는 낮았다. 평균 점추정이 가장 높다는 관찰과 일관된 우수성이 확인됐다는 결론은 구분해야 한다(그림 3).</w:t>
+      </w:r>
+    </w:p>
+    <w:p>
+      <w:pPr>
+        <w:widowControl/>
         <w:snapToGrid w:val="0"/>
         <w:jc w:val="center"/>
-        <w:spacing w:before="25" w:after="55" w:line="218" w:lineRule="atLeast"/>
+        <w:spacing w:before="0" w:after="35" w:line="234" w:lineRule="exact"/>
+        <w:ind w:firstLine="180"/>
       </w:pPr>
       <w:r>
         <w:rPr>
@@ -650,19 +688,19 @@
     <w:p>
       <w:pPr>
         <w:widowControl/>
-        <w:keepLines/>
         <w:snapToGrid w:val="0"/>
         <w:jc w:val="center"/>
-        <w:spacing w:before="25" w:after="55" w:line="218" w:lineRule="atLeast"/>
-      </w:pPr>
-      <w:r>
-        <w:rPr>
-          <w:rFonts w:ascii="Arial" w:hAnsi="Arial" w:eastAsia="맑은 고딕" w:cs="Arial"/>
-          <w:sz w:val="19"/>
-          <w:szCs w:val="19"/>
-          <w:color w:val="000000"/>
-        </w:rPr>
-        <w:t xml:space="preserve">(그림2)</w:t>
+        <w:spacing w:before="0" w:after="35" w:line="234" w:lineRule="exact"/>
+        <w:ind w:firstLine="180"/>
+      </w:pPr>
+      <w:r>
+        <w:rPr>
+          <w:rFonts w:ascii="Arial" w:hAnsi="Arial" w:eastAsia="맑은 고딕" w:cs="Arial"/>
+          <w:sz w:val="19"/>
+          <w:szCs w:val="19"/>
+          <w:color w:val="000000"/>
+        </w:rPr>
+        <w:t xml:space="preserve">(그림3)</w:t>
       </w:r>
     </w:p>
     <w:p>
@@ -680,7 +718,7 @@
           <w:szCs w:val="19"/>
           <w:color w:val="000000"/>
         </w:rPr>
-        <w:t xml:space="preserve">같은 공동분포 출력을 사용하는 jMLP의 macro AP는 0.3485였다. 주대조 jEPF−jMLP는 0.0030, 95% 구간은 −0.0024–0.0088로 0을 포함하였다. macro AUROC는 jLinear가 0.7372로 가장 높았지만 이 모델의 macro AP는 0.3444로 낮은 편이었다. 따라서 순위 구분, 양성군 회수, 확률의 적합성을 함께 살펴야 하며 한 지표의 순위를 전체 성능으로 바꿔 읽어서는 안 된다.</w:t>
+        <w:t xml:space="preserve">같은 공동분포 출력의 jMLP 대비 EPF 차이는 0.0055, 미보정 95% 구간은 [+0.0002, +0.0104]였고 5개 해 중 4개에서 높았다. 다만 이는 보조 대비이며 다중 비교와 학습 seed 변동을 고려한 구조적 우위의 확증으로 제시하지 않는다. EPF의 단일 seed 평균 연도 AP 범위는 0.3525–0.3575였다. 연도별 AP 평균과 전체 OOF AP는 계산 대상이 다르므로 서로 바꾸어 인용하지 않았다.</w:t>
       </w:r>
     </w:p>
     <w:p>
@@ -700,7 +738,7 @@
           <w:color w:val="000000"/>
           <w:b/>
         </w:rPr>
-        <w:t xml:space="preserve">3.2 대사소견 유형별 성능</w:t>
+        <w:t xml:space="preserve">3.2 아형별 분류와 결정의 한계</w:t>
       </w:r>
     </w:p>
     <w:p>
@@ -718,25 +756,45 @@
           <w:szCs w:val="19"/>
           <w:color w:val="000000"/>
         </w:rPr>
-        <w:t xml:space="preserve">jEPF의 군별 AP는 정상 0.8439, 혈압 단독 0.0782, 혈당 단독 0.0996, 지질 단독 0.3196, 복합 0.4162였다. 그림 3처럼 단독 혈압·혈당군의 낮은 AP는 다른 모델에서도 나타났다. jEPF가 일부 군에서 높은 값을 보여도 모든 군에서 일관되게 가장 좋은 것은 아니었다. 혈압 단독에서는 직접 MLP가 0.0838, 혈당 단독에서는 RF가 0.1170으로 더 높았다.</w:t>
-      </w:r>
-    </w:p>
-    <w:p>
-      <w:pPr>
-        <w:widowControl/>
+        <w:t xml:space="preserve">EPF 전체 OOF의 군별 AP는 정상 0.8421, 혈압 단독 0.0726, 혈당 단독 0.1040, 지질 단독 0.3129, 복합 0.4087였다. 최대 확률의 한 군을 선택한 조사 가중 혼동행렬에서 정상과 복합군의 재현율은 각각 92.4%, 53.6%였지만 혈압·혈당 단독군은 0%, 지질 단독군은 9.9%였다(그림 4). AP는 순위 성능을 측정하며 이 결정 규칙의 민감도와 같지 않다. 따라서 현재 결과로 단독 소견을 임상적으로 조기 선별할 수 있다고 주장하지 않는다.</w:t>
+      </w:r>
+    </w:p>
+    <w:p>
+      <w:pPr>
+        <w:widowControl/>
+        <w:snapToGrid w:val="0"/>
+        <w:jc w:val="center"/>
+        <w:spacing w:before="0" w:after="35" w:line="234" w:lineRule="exact"/>
+        <w:ind w:firstLine="180"/>
+      </w:pPr>
+      <w:r>
+        <w:rPr>
+          <w:rFonts w:ascii="Arial" w:hAnsi="Arial" w:eastAsia="맑은 고딕" w:cs="Arial"/>
+          <w:sz w:val="19"/>
+          <w:szCs w:val="19"/>
+          <w:color w:val="000000"/>
+        </w:rPr>
+        <w:t xml:space="preserve">(그림4)</w:t>
+      </w:r>
+    </w:p>
+    <w:p>
+      <w:pPr>
+        <w:widowControl/>
+        <w:keepNext/>
         <w:keepLines/>
         <w:snapToGrid w:val="0"/>
-        <w:jc w:val="center"/>
-        <w:spacing w:before="25" w:after="55" w:line="218" w:lineRule="atLeast"/>
-      </w:pPr>
-      <w:r>
-        <w:rPr>
-          <w:rFonts w:ascii="Arial" w:hAnsi="Arial" w:eastAsia="맑은 고딕" w:cs="Arial"/>
-          <w:sz w:val="19"/>
-          <w:szCs w:val="19"/>
-          <w:color w:val="000000"/>
-        </w:rPr>
-        <w:t xml:space="preserve">(그림3)</w:t>
+        <w:jc w:val="left"/>
+        <w:spacing w:before="65" w:after="30" w:line="246" w:lineRule="atLeast"/>
+      </w:pPr>
+      <w:r>
+        <w:rPr>
+          <w:rFonts w:ascii="Arial" w:hAnsi="Arial" w:eastAsia="맑은 고딕" w:cs="Arial"/>
+          <w:sz w:val="19"/>
+          <w:szCs w:val="19"/>
+          <w:color w:val="000000"/>
+          <w:b/>
+        </w:rPr>
+        <w:t xml:space="preserve">3.3 EPF가 활용한 생활습관 정보</w:t>
       </w:r>
     </w:p>
     <w:p>
@@ -754,27 +812,25 @@
           <w:szCs w:val="19"/>
           <w:color w:val="000000"/>
         </w:rPr>
-        <w:t xml:space="preserve">정상군은 전체의 62.0%인 반면 혈압·혈당 단독군은 각각 4.1%, 5.2%였다(비가중 비율). 작은 양성군에서의 성능과 정상군의 높은 AP를 구분해 제시해야 비침습적 선별이 어느 유형까지 가능한지 판단할 수 있다. macro AP는 이 차이를 평균에 반영하지만, 단독 소견을 놓치는 문제 자체를 해소하지는 않는다.</w:t>
-      </w:r>
-    </w:p>
-    <w:p>
-      <w:pPr>
-        <w:widowControl/>
-        <w:keepNext/>
-        <w:keepLines/>
-        <w:snapToGrid w:val="0"/>
-        <w:jc w:val="left"/>
-        <w:spacing w:before="95" w:after="45" w:line="260" w:lineRule="atLeast"/>
-      </w:pPr>
-      <w:r>
-        <w:rPr>
-          <w:rFonts w:ascii="Arial" w:hAnsi="Arial" w:eastAsia="맑은 고딕" w:cs="Arial"/>
-          <w:sz w:val="21"/>
-          <w:szCs w:val="21"/>
-          <w:color w:val="000000"/>
-          <w:b/>
-        </w:rPr>
-        <w:t xml:space="preserve">4. 논의 및 결론</w:t>
+        <w:t xml:space="preserve">EPF의 평균 절대 SHAP은 허리둘레 0.0401, WHtR 0.0342, 연령 0.0242, BMI 0.0171, 성별 0.0166 순이었다. 생활습관에서는 월간음주 0.0118과 현재흡연 0.0094가 높았다(그림 5). 신체계측 변수의 상관으로 기여가 분산될 수 있고, 성별은 HDL 절단값의 차이에도 관여하므로 이 순위를 독립적인 생물학적 영향의 크기로 해석하지 않았다.</w:t>
+      </w:r>
+    </w:p>
+    <w:p>
+      <w:pPr>
+        <w:widowControl/>
+        <w:snapToGrid w:val="0"/>
+        <w:jc w:val="center"/>
+        <w:spacing w:before="0" w:after="35" w:line="234" w:lineRule="exact"/>
+        <w:ind w:firstLine="180"/>
+      </w:pPr>
+      <w:r>
+        <w:rPr>
+          <w:rFonts w:ascii="Arial" w:hAnsi="Arial" w:eastAsia="맑은 고딕" w:cs="Arial"/>
+          <w:sz w:val="19"/>
+          <w:szCs w:val="19"/>
+          <w:color w:val="000000"/>
+        </w:rPr>
+        <w:t xml:space="preserve">(그림5)</w:t>
       </w:r>
     </w:p>
     <w:p>
@@ -792,7 +848,27 @@
           <w:szCs w:val="19"/>
           <w:color w:val="000000"/>
         </w:rPr>
-        <w:t xml:space="preserve">2020–2024년 청년 표본에서 다섯 대사소견군을 비교한 결과, LGBM과 jEPF의 macro AP는 거의 같았으며 jEPF의 구조적 우위를 확인하지 못했다. 공동분포 모델은 검사값의 연속 정보와 소견 조합을 함께 표현할 수 있지만, 이번 자료에서 그 표현이 다섯 군의 분류 성능을 일관되게 높이지는 않았다. EPF도 동일한 조건에서 검토할 수 있는 신경망 비교군으로서 의미가 있다.</w:t>
+        <w:t xml:space="preserve">현재흡연과 좌식시간은 지질 단독·복합군, 체중 증가는 복합군 확률에 양의 기여 차이를 보였고 이러한 방향은 다섯 해에서 유지되었다. 그러나 배타적 아형에서는 한 군의 확률 감소가 다른 군으로의 이동을 반영할 수 있다. 이 부호를 전체 검사 위험 감소로 바꾸어 읽지 않도록 동일 EPF의 네 원래 소견 확률에 대한 SHAP을 보조적으로 확인하였다. 이 보조 분석은 아형 부호를 확인한 뒤 추가한 해석 점검이며 주 성능 비교를 바꾸지 않았다. 중요도와 방향의 재현은 생활습관 관련 후보를 제시하지만, 해당 행동을 바꾸었을 때 건강 결과가 개선된다는 인과효과를 뜻하지 않는다.</w:t>
+      </w:r>
+    </w:p>
+    <w:p>
+      <w:pPr>
+        <w:widowControl/>
+        <w:keepNext/>
+        <w:keepLines/>
+        <w:snapToGrid w:val="0"/>
+        <w:jc w:val="left"/>
+        <w:spacing w:before="95" w:after="45" w:line="260" w:lineRule="atLeast"/>
+      </w:pPr>
+      <w:r>
+        <w:rPr>
+          <w:rFonts w:ascii="Arial" w:hAnsi="Arial" w:eastAsia="맑은 고딕" w:cs="Arial"/>
+          <w:sz w:val="21"/>
+          <w:szCs w:val="21"/>
+          <w:color w:val="000000"/>
+          <w:b/>
+        </w:rPr>
+        <w:t xml:space="preserve">4. 논의 및 결론</w:t>
       </w:r>
     </w:p>
     <w:p>
@@ -810,7 +886,7 @@
           <w:szCs w:val="19"/>
           <w:color w:val="000000"/>
         </w:rPr>
-        <w:t xml:space="preserve">주 지표와 계산 경로를 함께 고려하면 LGBM은 추가적인 분포 적분 없이 다섯 군을 직접 분류하는 우선 검토 후보이고, LR은 비교 기준으로 유지할 수 있다. 여러 소견의 조합 확률까지 출력해야 하는 경우에는 공동분포 모델이 별도의 후보가 된다. 다만 군별 AP가 낮은 혈압·혈당 단독군까지 실제 선별에 쓰려면 독립 자료에서 민감도·양성예측도와 의뢰율을 확인해야 한다. 본 비교에는 임상 적용을 위한 절단값 검증이 포함되지 않았다.</w:t>
+        <w:t xml:space="preserve">본 연구는 EPF의 상태·사건·가소성 갱신과 공동분포 출력을 비침습적 청년층 대사이상 분류에 적용하고, 한 해씩 제외한 다섯 회 검증과 EPF 자체의 SHAP 분석을 연결하였다. 평균 연도 AP의 점추정은 비교군 중 가장 높았고 같은 공동분포 MLP보다 높은 보조 결과가 관찰되었다. 그러나 LGBM과의 주대조 구간이 0을 포함하고 일부 시험연도 및 단독 아형에서 한계가 남아, 기존 모델 전반에 대한 우월성을 확정하지는 못했다.</w:t>
       </w:r>
     </w:p>
     <w:p>
@@ -828,25 +904,7 @@
           <w:szCs w:val="19"/>
           <w:color w:val="000000"/>
         </w:rPr>
-        <w:t xml:space="preserve">분석 대상은 진단·복약·공복·검사 완전성 및 영양조사 참여 조건을 충족한 사람으로 제한되어 전체 청년층과 다를 수 있다. 자가계측 자료가 아니라 조사에서 측정한 BMI·허리둘레를 사용했으므로, 가정에서 측정할 때의 오차도 따로 평가해야 한다. 연도별 혈압계와 검사기관·분석법 변경에 대한 별도 전환식 민감도 분석을 수행하지 않았으며, 반복 횡단면 자료만으로 미래 발병이나 생활습관의 원인 효과를 추론할 수 없다. 모델 재학습 불확실성과 다중 보조 비교도 남아 있는 한계다.</w:t>
-      </w:r>
-    </w:p>
-    <w:p>
-      <w:pPr>
-        <w:widowControl/>
-        <w:snapToGrid w:val="0"/>
-        <w:jc w:val="both"/>
-        <w:spacing w:before="0" w:after="35" w:line="234" w:lineRule="exact"/>
-        <w:ind w:firstLine="180"/>
-      </w:pPr>
-      <w:r>
-        <w:rPr>
-          <w:rFonts w:ascii="Arial" w:hAnsi="Arial" w:eastAsia="맑은 고딕" w:cs="Arial"/>
-          <w:sz w:val="19"/>
-          <w:szCs w:val="19"/>
-          <w:color w:val="000000"/>
-        </w:rPr>
-        <w:t xml:space="preserve">본 연구는 청년층 대사소견을 다섯 군으로 나누고 공통 표본·입력·조사구 분할에서 기존 분류기와 구현 신경망을 비교한 결과를 제시하였다. 현재 결과는 특정 모델의 임상적 우수성보다 유형별 분류의 한계를 보여준다. 후속 적용에서는 LGBM을 직접 분류의 우선 후보로 검토하되 LR과의 비교를 유지하고, 소견 조합 출력이 필요한 목적에 한해 공동분포 모델의 추가 가치를 평가할 수 있다.</w:t>
+        <w:t xml:space="preserve">분석은 진단·공복·검사 완전성 및 영양조사 참여 조건을 만족한 표본에 제한된다. 2021년 혈압계와 2022년 검사기관·분석법 변경에 대한 별도 전환식 민감도 분석을 수행하지 않았으며, 이미 분석한 KNHANES의 연도 제외 검증을 독립적인 외부 검증으로 부르지 않았다. 다섯 회 중 과거를 학습해 이후 연도를 평가하는 조건은 2024년 시험이다. 횡단면 자료와 SHAP만으로 질환 원인이나 예방 효과를 확인할 수 없고, 실제 자가계측 오차와 임상 절단값도 별도 검증이 필요하다. EPF를 후속 검증할 모델로 제시하면서 생활습관 관련 후보의 재현성을 확인하는 범위에서 결과를 해석한다.</w:t>
       </w:r>
     </w:p>
     <w:p>
@@ -945,6 +1003,26 @@
       <w:pPr>
         <w:widowControl/>
         <w:snapToGrid w:val="0"/>
+        <w:jc w:val="both"/>
+        <w:spacing w:before="0" w:after="0" w:line="20" w:lineRule="exact"/>
+      </w:pPr>
+      <w:r>
+        <w:rPr>
+          <w:rFonts w:ascii="Arial" w:hAnsi="Arial" w:eastAsia="맑은 고딕" w:cs="Arial"/>
+          <w:sz w:val="19"/>
+          <w:szCs w:val="19"/>
+          <w:color w:val="000000"/>
+        </w:rPr>
+        <w:t xml:space="preserve"/>
+      </w:r>
+      <w:r>
+        <w:br w:type="column"/>
+      </w:r>
+    </w:p>
+    <w:p>
+      <w:pPr>
+        <w:widowControl/>
+        <w:snapToGrid w:val="0"/>
         <w:jc w:val="left"/>
         <w:spacing w:before="0" w:after="18" w:line="225" w:lineRule="exact"/>
         <w:ind w:left="190" w:hanging="190"/>
@@ -998,6 +1076,24 @@
     <w:p>
       <w:pPr>
         <w:widowControl/>
+        <w:snapToGrid w:val="0"/>
+        <w:jc w:val="left"/>
+        <w:spacing w:before="0" w:after="18" w:line="225" w:lineRule="exact"/>
+        <w:ind w:left="190" w:hanging="190"/>
+      </w:pPr>
+      <w:r>
+        <w:rPr>
+          <w:rFonts w:ascii="Arial" w:hAnsi="Arial" w:eastAsia="맑은 고딕" w:cs="Arial"/>
+          <w:sz w:val="18"/>
+          <w:szCs w:val="18"/>
+          <w:color w:val="000000"/>
+        </w:rPr>
+        <w:t xml:space="preserve">[8] S. M. Lundberg and S.-I. Lee, “A Unified Approach to Interpreting Model Predictions,” in Advances in Neural Information Processing Systems, vol. 30, pp. 4765–4774, 2017.</w:t>
+      </w:r>
+    </w:p>
+    <w:p>
+      <w:pPr>
+        <w:widowControl/>
         <w:keepNext/>
         <w:keepLines/>
         <w:snapToGrid w:val="0"/>
@@ -1017,9 +1113,9 @@
       <w:r>
         <w:drawing>
           <wp:inline distT="0" distB="0" distL="0" distR="0">
-            <wp:extent cx="3175200" cy="2238107"/>
+            <wp:extent cx="3175200" cy="2229009"/>
             <wp:effectExtent l="0" t="0" r="0" b="0"/>
-            <wp:docPr id="1" name="fig1_pipeline" descr="대상자 선정과 공통 평가 절차"/>
+            <wp:docPr id="1" name="figure1" descr="대상자 선정과 연도 제외 검증"/>
             <wp:cNvGraphicFramePr>
               <ns2:graphicFrameLocks xmlns:ns2="http://schemas.openxmlformats.org/drawingml/2006/main" noChangeAspect="1"/>
             </wp:cNvGraphicFramePr>
@@ -1027,11 +1123,11 @@
               <ns3:graphicData uri="http://schemas.openxmlformats.org/drawingml/2006/picture">
                 <ns4:pic xmlns:ns4="http://schemas.openxmlformats.org/drawingml/2006/picture">
                   <ns4:nvPicPr>
-                    <ns4:cNvPr id="0" name="fig1_pipeline.png"/>
+                    <ns4:cNvPr id="0" name="figure1.png"/>
                     <ns4:cNvPicPr/>
                   </ns4:nvPicPr>
                   <ns4:blipFill>
-                    <ns3:blip r:embed="rIdPaperImage1"/>
+                    <ns3:blip r:embed="rIdEPFPaperImage1"/>
                     <ns3:stretch>
                       <ns3:fillRect/>
                     </ns3:stretch>
@@ -1039,7 +1135,7 @@
                   <ns4:spPr>
                     <ns3:xfrm>
                       <ns3:off x="0" y="0"/>
-                      <ns3:ext cx="3175200" cy="2238107"/>
+                      <ns3:ext cx="3175200" cy="2229009"/>
                     </ns3:xfrm>
                     <ns3:prstGeom prst="rect">
                       <ns3:avLst/>
@@ -1067,7 +1163,7 @@
           <w:szCs w:val="18"/>
           <w:color w:val="000000"/>
         </w:rPr>
-        <w:t xml:space="preserve">그림 1. 공통 대상자 선정과 두 학습 경로. 모든 모델에 같은 15개 입력과 조사구 분할을 적용하였다.</w:t>
+        <w:t xml:space="preserve">그림 1. 대상자 선정과 연도 제외 검증의 흐름. 한 해 전체를 시험용으로 남기고 나머지 네 해에서 학습·설정 선택·재학습을 수행하였다.</w:t>
       </w:r>
     </w:p>
     <w:p>
@@ -1091,9 +1187,9 @@
       <w:r>
         <w:drawing>
           <wp:inline distT="0" distB="0" distL="0" distR="0">
-            <wp:extent cx="3175200" cy="2265401"/>
+            <wp:extent cx="3175200" cy="2956848"/>
             <wp:effectExtent l="0" t="0" r="0" b="0"/>
-            <wp:docPr id="2" name="fig2_macro_ap" descr="모델별 macro AP와 95% 구간"/>
+            <wp:docPr id="2" name="figure2" descr="EPF 구조와 입력 및 정답의 분리"/>
             <wp:cNvGraphicFramePr>
               <ns2:graphicFrameLocks xmlns:ns2="http://schemas.openxmlformats.org/drawingml/2006/main" noChangeAspect="1"/>
             </wp:cNvGraphicFramePr>
@@ -1101,11 +1197,11 @@
               <ns3:graphicData uri="http://schemas.openxmlformats.org/drawingml/2006/picture">
                 <ns4:pic xmlns:ns4="http://schemas.openxmlformats.org/drawingml/2006/picture">
                   <ns4:nvPicPr>
-                    <ns4:cNvPr id="0" name="fig2_macro_ap.png"/>
+                    <ns4:cNvPr id="0" name="figure2.png"/>
                     <ns4:cNvPicPr/>
                   </ns4:nvPicPr>
                   <ns4:blipFill>
-                    <ns3:blip r:embed="rIdPaperImage2"/>
+                    <ns3:blip r:embed="rIdEPFPaperImage2"/>
                     <ns3:stretch>
                       <ns3:fillRect/>
                     </ns3:stretch>
@@ -1113,7 +1209,7 @@
                   <ns4:spPr>
                     <ns3:xfrm>
                       <ns3:off x="0" y="0"/>
-                      <ns3:ext cx="3175200" cy="2265401"/>
+                      <ns3:ext cx="3175200" cy="2956848"/>
                     </ns3:xfrm>
                     <ns3:prstGeom prst="rect">
                       <ns3:avLst/>
@@ -1141,7 +1237,27 @@
           <w:szCs w:val="18"/>
           <w:color w:val="000000"/>
         </w:rPr>
-        <w:t xml:space="preserve">그림 2. 모델별 macro AP와 95% PSU 재표집 구간. 작은 차이가 보이도록 가로축을 확대하였다.</w:t>
+        <w:t xml:space="preserve">그림 2. EPF의 입력·내부 상태·공동분포 출력. 관측 검사값은 학습 정답 경로에만 사용하며 예측 시 입력하지 않는다.</w:t>
+      </w:r>
+    </w:p>
+    <w:p>
+      <w:pPr>
+        <w:widowControl/>
+        <w:snapToGrid w:val="0"/>
+        <w:jc w:val="both"/>
+        <w:spacing w:before="0" w:after="0" w:line="20" w:lineRule="exact"/>
+      </w:pPr>
+      <w:r>
+        <w:rPr>
+          <w:rFonts w:ascii="Arial" w:hAnsi="Arial" w:eastAsia="맑은 고딕" w:cs="Arial"/>
+          <w:sz w:val="19"/>
+          <w:szCs w:val="19"/>
+          <w:color w:val="000000"/>
+        </w:rPr>
+        <w:t xml:space="preserve"/>
+      </w:r>
+      <w:r>
+        <w:br w:type="column"/>
       </w:r>
     </w:p>
     <w:p>
@@ -1165,9 +1281,9 @@
       <w:r>
         <w:drawing>
           <wp:inline distT="0" distB="0" distL="0" distR="0">
-            <wp:extent cx="3175200" cy="2338185"/>
+            <wp:extent cx="3175200" cy="3502728"/>
             <wp:effectExtent l="0" t="0" r="0" b="0"/>
-            <wp:docPr id="3" name="fig3_class_ap" descr="이상소견군별 AP 비교"/>
+            <wp:docPr id="3" name="figure3" descr="연도별 모델 성능과 조건부 구간"/>
             <wp:cNvGraphicFramePr>
               <ns2:graphicFrameLocks xmlns:ns2="http://schemas.openxmlformats.org/drawingml/2006/main" noChangeAspect="1"/>
             </wp:cNvGraphicFramePr>
@@ -1175,11 +1291,11 @@
               <ns3:graphicData uri="http://schemas.openxmlformats.org/drawingml/2006/picture">
                 <ns4:pic xmlns:ns4="http://schemas.openxmlformats.org/drawingml/2006/picture">
                   <ns4:nvPicPr>
-                    <ns4:cNvPr id="0" name="fig3_class_ap.png"/>
+                    <ns4:cNvPr id="0" name="figure3.png"/>
                     <ns4:cNvPicPr/>
                   </ns4:nvPicPr>
                   <ns4:blipFill>
-                    <ns3:blip r:embed="rIdPaperImage3"/>
+                    <ns3:blip r:embed="rIdEPFPaperImage3"/>
                     <ns3:stretch>
                       <ns3:fillRect/>
                     </ns3:stretch>
@@ -1187,7 +1303,7 @@
                   <ns4:spPr>
                     <ns3:xfrm>
                       <ns3:off x="0" y="0"/>
-                      <ns3:ext cx="3175200" cy="2338185"/>
+                      <ns3:ext cx="3175200" cy="3502728"/>
                     </ns3:xfrm>
                     <ns3:prstGeom prst="rect">
                       <ns3:avLst/>
@@ -1215,7 +1331,63 @@
           <w:szCs w:val="18"/>
           <w:color w:val="000000"/>
         </w:rPr>
-        <w:t xml:space="preserve">그림 3. 이상소견 네 군의 AP. 빈 원은 나머지 비교 모델이며 점선은 각 군의 조사 가중 비율이다. 점의 가로 이동은 겹침을 피하기 위한 표시다.</w:t>
+        <w:t xml:space="preserve">그림 3. 모델별 평균 시험연도 AP와 95% 조건부 구간(위), 시험연도별 AP(아래). 흐린 선은 나머지 비교 모델이다.</w:t>
+      </w:r>
+    </w:p>
+    <w:p>
+      <w:pPr>
+        <w:widowControl/>
+        <w:keepNext/>
+        <w:keepLines/>
+        <w:snapToGrid w:val="0"/>
+        <w:jc w:val="center"/>
+        <w:spacing w:before="30" w:after="10" w:line="240" w:lineRule="atLeast"/>
+      </w:pPr>
+      <w:r>
+        <w:rPr>
+          <w:rFonts w:ascii="Arial" w:hAnsi="Arial" w:eastAsia="맑은 고딕" w:cs="Arial"/>
+          <w:sz w:val="19"/>
+          <w:szCs w:val="19"/>
+          <w:color w:val="000000"/>
+        </w:rPr>
+        <w:t xml:space="preserve"/>
+      </w:r>
+      <w:r>
+        <w:drawing>
+          <wp:inline distT="0" distB="0" distL="0" distR="0">
+            <wp:extent cx="3175200" cy="2410968"/>
+            <wp:effectExtent l="0" t="0" r="0" b="0"/>
+            <wp:docPr id="4" name="figure4" descr="EPF 최대확률 분류 혼동행렬"/>
+            <wp:cNvGraphicFramePr>
+              <ns2:graphicFrameLocks xmlns:ns2="http://schemas.openxmlformats.org/drawingml/2006/main" noChangeAspect="1"/>
+            </wp:cNvGraphicFramePr>
+            <ns3:graphic xmlns:ns3="http://schemas.openxmlformats.org/drawingml/2006/main">
+              <ns3:graphicData uri="http://schemas.openxmlformats.org/drawingml/2006/picture">
+                <ns4:pic xmlns:ns4="http://schemas.openxmlformats.org/drawingml/2006/picture">
+                  <ns4:nvPicPr>
+                    <ns4:cNvPr id="0" name="figure4.png"/>
+                    <ns4:cNvPicPr/>
+                  </ns4:nvPicPr>
+                  <ns4:blipFill>
+                    <ns3:blip r:embed="rIdEPFPaperImage4"/>
+                    <ns3:stretch>
+                      <ns3:fillRect/>
+                    </ns3:stretch>
+                  </ns4:blipFill>
+                  <ns4:spPr>
+                    <ns3:xfrm>
+                      <ns3:off x="0" y="0"/>
+                      <ns3:ext cx="3175200" cy="2410968"/>
+                    </ns3:xfrm>
+                    <ns3:prstGeom prst="rect">
+                      <ns3:avLst/>
+                    </ns3:prstGeom>
+                  </ns4:spPr>
+                </ns4:pic>
+              </ns3:graphicData>
+            </ns3:graphic>
+          </wp:inline>
+        </w:drawing>
       </w:r>
     </w:p>
     <w:p>
@@ -1233,10 +1405,7 @@
           <w:szCs w:val="18"/>
           <w:color w:val="000000"/>
         </w:rPr>
-        <w:t xml:space="preserve"/>
-      </w:r>
-      <w:r>
-        <w:br w:type="column"/>
+        <w:t xml:space="preserve">그림 4. EPF 전체 OOF 예측의 조사 가중 행 정규화 혼동행렬. 결정 규칙은 다섯 군 중 최대 확률 선택이다.</w:t>
       </w:r>
     </w:p>
     <w:p>
@@ -1246,6 +1415,62 @@
         <w:keepLines/>
         <w:snapToGrid w:val="0"/>
         <w:jc w:val="center"/>
+        <w:spacing w:before="30" w:after="10" w:line="240" w:lineRule="atLeast"/>
+        <w:pageBreakBefore/>
+      </w:pPr>
+      <w:r>
+        <w:rPr>
+          <w:rFonts w:ascii="Arial" w:hAnsi="Arial" w:eastAsia="맑은 고딕" w:cs="Arial"/>
+          <w:sz w:val="19"/>
+          <w:szCs w:val="19"/>
+          <w:color w:val="000000"/>
+        </w:rPr>
+        <w:t xml:space="preserve"/>
+      </w:r>
+      <w:r>
+        <w:drawing>
+          <wp:inline distT="0" distB="0" distL="0" distR="0">
+            <wp:extent cx="3175200" cy="3320768"/>
+            <wp:effectExtent l="0" t="0" r="0" b="0"/>
+            <wp:docPr id="5" name="figure5" descr="EPF 원입력 SHAP 중요도"/>
+            <wp:cNvGraphicFramePr>
+              <ns2:graphicFrameLocks xmlns:ns2="http://schemas.openxmlformats.org/drawingml/2006/main" noChangeAspect="1"/>
+            </wp:cNvGraphicFramePr>
+            <ns3:graphic xmlns:ns3="http://schemas.openxmlformats.org/drawingml/2006/main">
+              <ns3:graphicData uri="http://schemas.openxmlformats.org/drawingml/2006/picture">
+                <ns4:pic xmlns:ns4="http://schemas.openxmlformats.org/drawingml/2006/picture">
+                  <ns4:nvPicPr>
+                    <ns4:cNvPr id="0" name="figure5.png"/>
+                    <ns4:cNvPicPr/>
+                  </ns4:nvPicPr>
+                  <ns4:blipFill>
+                    <ns3:blip r:embed="rIdEPFPaperImage5"/>
+                    <ns3:stretch>
+                      <ns3:fillRect/>
+                    </ns3:stretch>
+                  </ns4:blipFill>
+                  <ns4:spPr>
+                    <ns3:xfrm>
+                      <ns3:off x="0" y="0"/>
+                      <ns3:ext cx="3175200" cy="3320768"/>
+                    </ns3:xfrm>
+                    <ns3:prstGeom prst="rect">
+                      <ns3:avLst/>
+                    </ns3:prstGeom>
+                  </ns4:spPr>
+                </ns4:pic>
+              </ns3:graphicData>
+            </ns3:graphic>
+          </wp:inline>
+        </w:drawing>
+      </w:r>
+    </w:p>
+    <w:p>
+      <w:pPr>
+        <w:widowControl/>
+        <w:keepLines/>
+        <w:snapToGrid w:val="0"/>
+        <w:jc w:val="left"/>
         <w:spacing w:before="25" w:after="55" w:line="218" w:lineRule="atLeast"/>
       </w:pPr>
       <w:r>
@@ -1255,7 +1480,46 @@
           <w:szCs w:val="18"/>
           <w:color w:val="000000"/>
         </w:rPr>
-        <w:t xml:space="preserve">표 1. 대사소견군의 정의와 비가중 인원</w:t>
+        <w:t xml:space="preserve">그림 5. EPF의 15개 원입력에 대한 평균 절대 SHAP. 주황색은 생활습관 입력이며 선은 다섯 시험연도 값의 범위로 신뢰구간이 아니다.</w:t>
+      </w:r>
+    </w:p>
+    <w:p>
+      <w:pPr>
+        <w:widowControl/>
+        <w:snapToGrid w:val="0"/>
+        <w:jc w:val="both"/>
+        <w:spacing w:before="0" w:after="0" w:line="20" w:lineRule="exact"/>
+      </w:pPr>
+      <w:r>
+        <w:rPr>
+          <w:rFonts w:ascii="Arial" w:hAnsi="Arial" w:eastAsia="맑은 고딕" w:cs="Arial"/>
+          <w:sz w:val="19"/>
+          <w:szCs w:val="19"/>
+          <w:color w:val="000000"/>
+        </w:rPr>
+        <w:t xml:space="preserve"/>
+      </w:r>
+      <w:r>
+        <w:br w:type="column"/>
+      </w:r>
+    </w:p>
+    <w:p>
+      <w:pPr>
+        <w:widowControl/>
+        <w:keepNext/>
+        <w:keepLines/>
+        <w:snapToGrid w:val="0"/>
+        <w:jc w:val="center"/>
+        <w:spacing w:before="25" w:after="55" w:line="218" w:lineRule="atLeast"/>
+      </w:pPr>
+      <w:r>
+        <w:rPr>
+          <w:rFonts w:ascii="Arial" w:hAnsi="Arial" w:eastAsia="맑은 고딕" w:cs="Arial"/>
+          <w:sz w:val="18"/>
+          <w:szCs w:val="18"/>
+          <w:color w:val="000000"/>
+        </w:rPr>
+        <w:t xml:space="preserve">표 1. 다섯 대사소견군의 정의와 비가중 인원</w:t>
       </w:r>
     </w:p>
     <w:tbl>
@@ -1738,6 +2002,23 @@
     <w:p>
       <w:pPr>
         <w:widowControl/>
+        <w:snapToGrid w:val="0"/>
+        <w:jc w:val="both"/>
+        <w:spacing w:before="0" w:after="0" w:line="20" w:lineRule="exact"/>
+      </w:pPr>
+      <w:r>
+        <w:rPr>
+          <w:rFonts w:ascii="Arial" w:hAnsi="Arial" w:eastAsia="맑은 고딕" w:cs="Arial"/>
+          <w:sz w:val="19"/>
+          <w:szCs w:val="19"/>
+          <w:color w:val="000000"/>
+        </w:rPr>
+        <w:t xml:space="preserve"/>
+      </w:r>
+    </w:p>
+    <w:p>
+      <w:pPr>
+        <w:widowControl/>
         <w:keepNext/>
         <w:keepLines/>
         <w:snapToGrid w:val="0"/>
@@ -1751,7 +2032,7 @@
           <w:szCs w:val="18"/>
           <w:color w:val="000000"/>
         </w:rPr>
-        <w:t xml:space="preserve">표 2. 조사 가중 OOF 성능 비교</w:t>
+        <w:t xml:space="preserve">표 2. 동일 표본에서의 연도 제외 분류 성능</w:t>
       </w:r>
     </w:p>
     <w:tbl>
@@ -1775,11 +2056,10 @@
         </w:tblCellMar>
       </w:tblPr>
       <w:tblGrid>
-        <w:gridCol w:w="1028"/>
-        <w:gridCol w:w="1028"/>
-        <w:gridCol w:w="1028"/>
-        <w:gridCol w:w="1028"/>
-        <w:gridCol w:w="914"/>
+        <w:gridCol w:w="857"/>
+        <w:gridCol w:w="1257"/>
+        <w:gridCol w:w="1828"/>
+        <w:gridCol w:w="1086"/>
       </w:tblGrid>
       <w:tr>
         <w:trPr>
@@ -1788,7 +2068,7 @@
         </w:trPr>
         <w:tc>
           <w:tcPr>
-            <w:tcW w:w="1028" w:type="dxa"/>
+            <w:tcW w:w="857" w:type="dxa"/>
             <w:vAlign w:val="center"/>
             <w:shd w:fill="EEF1F4" w:val="clear"/>
           </w:tcPr>
@@ -1813,7 +2093,7 @@
         </w:tc>
         <w:tc>
           <w:tcPr>
-            <w:tcW w:w="1028" w:type="dxa"/>
+            <w:tcW w:w="1257" w:type="dxa"/>
             <w:vAlign w:val="center"/>
             <w:shd w:fill="EEF1F4" w:val="clear"/>
           </w:tcPr>
@@ -1832,13 +2112,13 @@
                 <w:color w:val="000000"/>
                 <w:b/>
               </w:rPr>
-              <w:t xml:space="preserve">macro AP</w:t>
-            </w:r>
-          </w:p>
-        </w:tc>
-        <w:tc>
-          <w:tcPr>
-            <w:tcW w:w="1028" w:type="dxa"/>
+              <w:t xml:space="preserve">평균 연도 AP</w:t>
+            </w:r>
+          </w:p>
+        </w:tc>
+        <w:tc>
+          <w:tcPr>
+            <w:tcW w:w="1828" w:type="dxa"/>
             <w:vAlign w:val="center"/>
             <w:shd w:fill="EEF1F4" w:val="clear"/>
           </w:tcPr>
@@ -1857,13 +2137,13 @@
                 <w:color w:val="000000"/>
                 <w:b/>
               </w:rPr>
-              <w:t xml:space="preserve">AUROC</w:t>
-            </w:r>
-          </w:p>
-        </w:tc>
-        <w:tc>
-          <w:tcPr>
-            <w:tcW w:w="1028" w:type="dxa"/>
+              <w:t xml:space="preserve">95% 구간</w:t>
+            </w:r>
+          </w:p>
+        </w:tc>
+        <w:tc>
+          <w:tcPr>
+            <w:tcW w:w="1086" w:type="dxa"/>
             <w:vAlign w:val="center"/>
             <w:shd w:fill="EEF1F4" w:val="clear"/>
           </w:tcPr>
@@ -1882,32 +2162,7 @@
                 <w:color w:val="000000"/>
                 <w:b/>
               </w:rPr>
-              <w:t xml:space="preserve">macro F1</w:t>
-            </w:r>
-          </w:p>
-        </w:tc>
-        <w:tc>
-          <w:tcPr>
-            <w:tcW w:w="914" w:type="dxa"/>
-            <w:vAlign w:val="center"/>
-            <w:shd w:fill="EEF1F4" w:val="clear"/>
-          </w:tcPr>
-          <w:p>
-            <w:pPr>
-              <w:widowControl/>
-              <w:snapToGrid w:val="0"/>
-              <w:jc w:val="center"/>
-              <w:spacing w:before="0" w:after="0" w:line="228" w:lineRule="atLeast"/>
-            </w:pPr>
-            <w:r>
-              <w:rPr>
-                <w:rFonts w:ascii="Arial" w:hAnsi="Arial" w:eastAsia="맑은 고딕" w:cs="Arial"/>
-                <w:sz w:val="18"/>
-                <w:szCs w:val="18"/>
-                <w:color w:val="000000"/>
-                <w:b/>
-              </w:rPr>
-              <w:t xml:space="preserve">NLL</w:t>
+              <w:t xml:space="preserve">전체 OOF AP</w:t>
             </w:r>
           </w:p>
         </w:tc>
@@ -1918,116 +2173,93 @@
         </w:trPr>
         <w:tc>
           <w:tcPr>
-            <w:tcW w:w="1028" w:type="dxa"/>
-            <w:vAlign w:val="center"/>
-          </w:tcPr>
-          <w:p>
-            <w:pPr>
-              <w:widowControl/>
-              <w:snapToGrid w:val="0"/>
-              <w:jc w:val="center"/>
-              <w:spacing w:before="0" w:after="0" w:line="228" w:lineRule="atLeast"/>
-            </w:pPr>
-            <w:r>
-              <w:rPr>
-                <w:rFonts w:ascii="Arial" w:hAnsi="Arial" w:eastAsia="맑은 고딕" w:cs="Arial"/>
-                <w:sz w:val="18"/>
-                <w:szCs w:val="18"/>
-                <w:color w:val="000000"/>
-              </w:rPr>
-              <w:t xml:space="preserve">LR</w:t>
-            </w:r>
-          </w:p>
-        </w:tc>
-        <w:tc>
-          <w:tcPr>
-            <w:tcW w:w="1028" w:type="dxa"/>
-            <w:vAlign w:val="center"/>
-          </w:tcPr>
-          <w:p>
-            <w:pPr>
-              <w:widowControl/>
-              <w:snapToGrid w:val="0"/>
-              <w:jc w:val="center"/>
-              <w:spacing w:before="0" w:after="0" w:line="228" w:lineRule="atLeast"/>
-            </w:pPr>
-            <w:r>
-              <w:rPr>
-                <w:rFonts w:ascii="Arial" w:hAnsi="Arial" w:eastAsia="맑은 고딕" w:cs="Arial"/>
-                <w:sz w:val="18"/>
-                <w:szCs w:val="18"/>
-                <w:color w:val="000000"/>
-              </w:rPr>
-              <w:t xml:space="preserve">0.3443</w:t>
-            </w:r>
-          </w:p>
-        </w:tc>
-        <w:tc>
-          <w:tcPr>
-            <w:tcW w:w="1028" w:type="dxa"/>
-            <w:vAlign w:val="center"/>
-          </w:tcPr>
-          <w:p>
-            <w:pPr>
-              <w:widowControl/>
-              <w:snapToGrid w:val="0"/>
-              <w:jc w:val="center"/>
-              <w:spacing w:before="0" w:after="0" w:line="228" w:lineRule="atLeast"/>
-            </w:pPr>
-            <w:r>
-              <w:rPr>
-                <w:rFonts w:ascii="Arial" w:hAnsi="Arial" w:eastAsia="맑은 고딕" w:cs="Arial"/>
-                <w:sz w:val="18"/>
-                <w:szCs w:val="18"/>
-                <w:color w:val="000000"/>
-              </w:rPr>
-              <w:t xml:space="preserve">0.7282</w:t>
-            </w:r>
-          </w:p>
-        </w:tc>
-        <w:tc>
-          <w:tcPr>
-            <w:tcW w:w="1028" w:type="dxa"/>
-            <w:vAlign w:val="center"/>
-          </w:tcPr>
-          <w:p>
-            <w:pPr>
-              <w:widowControl/>
-              <w:snapToGrid w:val="0"/>
-              <w:jc w:val="center"/>
-              <w:spacing w:before="0" w:after="0" w:line="228" w:lineRule="atLeast"/>
-            </w:pPr>
-            <w:r>
-              <w:rPr>
-                <w:rFonts w:ascii="Arial" w:hAnsi="Arial" w:eastAsia="맑은 고딕" w:cs="Arial"/>
-                <w:sz w:val="18"/>
-                <w:szCs w:val="18"/>
-                <w:color w:val="000000"/>
-              </w:rPr>
-              <w:t xml:space="preserve">0.2710</w:t>
-            </w:r>
-          </w:p>
-        </w:tc>
-        <w:tc>
-          <w:tcPr>
-            <w:tcW w:w="914" w:type="dxa"/>
-            <w:vAlign w:val="center"/>
-          </w:tcPr>
-          <w:p>
-            <w:pPr>
-              <w:widowControl/>
-              <w:snapToGrid w:val="0"/>
-              <w:jc w:val="center"/>
-              <w:spacing w:before="0" w:after="0" w:line="228" w:lineRule="atLeast"/>
-            </w:pPr>
-            <w:r>
-              <w:rPr>
-                <w:rFonts w:ascii="Arial" w:hAnsi="Arial" w:eastAsia="맑은 고딕" w:cs="Arial"/>
-                <w:sz w:val="18"/>
-                <w:szCs w:val="18"/>
-                <w:color w:val="000000"/>
-              </w:rPr>
-              <w:t xml:space="preserve">0.9926</w:t>
+            <w:tcW w:w="857" w:type="dxa"/>
+            <w:vAlign w:val="center"/>
+          </w:tcPr>
+          <w:p>
+            <w:pPr>
+              <w:widowControl/>
+              <w:snapToGrid w:val="0"/>
+              <w:jc w:val="center"/>
+              <w:spacing w:before="0" w:after="0" w:line="228" w:lineRule="atLeast"/>
+            </w:pPr>
+            <w:r>
+              <w:rPr>
+                <w:rFonts w:ascii="Arial" w:hAnsi="Arial" w:eastAsia="맑은 고딕" w:cs="Arial"/>
+                <w:sz w:val="18"/>
+                <w:szCs w:val="18"/>
+                <w:color w:val="000000"/>
+              </w:rPr>
+              <w:t xml:space="preserve">jEPF</w:t>
+            </w:r>
+          </w:p>
+        </w:tc>
+        <w:tc>
+          <w:tcPr>
+            <w:tcW w:w="1257" w:type="dxa"/>
+            <w:vAlign w:val="center"/>
+          </w:tcPr>
+          <w:p>
+            <w:pPr>
+              <w:widowControl/>
+              <w:snapToGrid w:val="0"/>
+              <w:jc w:val="center"/>
+              <w:spacing w:before="0" w:after="0" w:line="228" w:lineRule="atLeast"/>
+            </w:pPr>
+            <w:r>
+              <w:rPr>
+                <w:rFonts w:ascii="Arial" w:hAnsi="Arial" w:eastAsia="맑은 고딕" w:cs="Arial"/>
+                <w:sz w:val="18"/>
+                <w:szCs w:val="18"/>
+                <w:color w:val="000000"/>
+              </w:rPr>
+              <w:t xml:space="preserve">0.3571</w:t>
+            </w:r>
+          </w:p>
+        </w:tc>
+        <w:tc>
+          <w:tcPr>
+            <w:tcW w:w="1828" w:type="dxa"/>
+            <w:vAlign w:val="center"/>
+          </w:tcPr>
+          <w:p>
+            <w:pPr>
+              <w:widowControl/>
+              <w:snapToGrid w:val="0"/>
+              <w:jc w:val="center"/>
+              <w:spacing w:before="0" w:after="0" w:line="228" w:lineRule="atLeast"/>
+            </w:pPr>
+            <w:r>
+              <w:rPr>
+                <w:rFonts w:ascii="Arial" w:hAnsi="Arial" w:eastAsia="맑은 고딕" w:cs="Arial"/>
+                <w:sz w:val="18"/>
+                <w:szCs w:val="18"/>
+                <w:color w:val="000000"/>
+              </w:rPr>
+              <w:t xml:space="preserve">0.3502–0.3774</w:t>
+            </w:r>
+          </w:p>
+        </w:tc>
+        <w:tc>
+          <w:tcPr>
+            <w:tcW w:w="1086" w:type="dxa"/>
+            <w:vAlign w:val="center"/>
+          </w:tcPr>
+          <w:p>
+            <w:pPr>
+              <w:widowControl/>
+              <w:snapToGrid w:val="0"/>
+              <w:jc w:val="center"/>
+              <w:spacing w:before="0" w:after="0" w:line="228" w:lineRule="atLeast"/>
+            </w:pPr>
+            <w:r>
+              <w:rPr>
+                <w:rFonts w:ascii="Arial" w:hAnsi="Arial" w:eastAsia="맑은 고딕" w:cs="Arial"/>
+                <w:sz w:val="18"/>
+                <w:szCs w:val="18"/>
+                <w:color w:val="000000"/>
+              </w:rPr>
+              <w:t xml:space="preserve">0.3481</w:t>
             </w:r>
           </w:p>
         </w:tc>
@@ -2038,116 +2270,93 @@
         </w:trPr>
         <w:tc>
           <w:tcPr>
-            <w:tcW w:w="1028" w:type="dxa"/>
-            <w:vAlign w:val="center"/>
-          </w:tcPr>
-          <w:p>
-            <w:pPr>
-              <w:widowControl/>
-              <w:snapToGrid w:val="0"/>
-              <w:jc w:val="center"/>
-              <w:spacing w:before="0" w:after="0" w:line="228" w:lineRule="atLeast"/>
-            </w:pPr>
-            <w:r>
-              <w:rPr>
-                <w:rFonts w:ascii="Arial" w:hAnsi="Arial" w:eastAsia="맑은 고딕" w:cs="Arial"/>
-                <w:sz w:val="18"/>
-                <w:szCs w:val="18"/>
-                <w:color w:val="000000"/>
-              </w:rPr>
-              <w:t xml:space="preserve">RF</w:t>
-            </w:r>
-          </w:p>
-        </w:tc>
-        <w:tc>
-          <w:tcPr>
-            <w:tcW w:w="1028" w:type="dxa"/>
-            <w:vAlign w:val="center"/>
-          </w:tcPr>
-          <w:p>
-            <w:pPr>
-              <w:widowControl/>
-              <w:snapToGrid w:val="0"/>
-              <w:jc w:val="center"/>
-              <w:spacing w:before="0" w:after="0" w:line="228" w:lineRule="atLeast"/>
-            </w:pPr>
-            <w:r>
-              <w:rPr>
-                <w:rFonts w:ascii="Arial" w:hAnsi="Arial" w:eastAsia="맑은 고딕" w:cs="Arial"/>
-                <w:sz w:val="18"/>
-                <w:szCs w:val="18"/>
-                <w:color w:val="000000"/>
-              </w:rPr>
-              <w:t xml:space="preserve">0.3439</w:t>
-            </w:r>
-          </w:p>
-        </w:tc>
-        <w:tc>
-          <w:tcPr>
-            <w:tcW w:w="1028" w:type="dxa"/>
-            <w:vAlign w:val="center"/>
-          </w:tcPr>
-          <w:p>
-            <w:pPr>
-              <w:widowControl/>
-              <w:snapToGrid w:val="0"/>
-              <w:jc w:val="center"/>
-              <w:spacing w:before="0" w:after="0" w:line="228" w:lineRule="atLeast"/>
-            </w:pPr>
-            <w:r>
-              <w:rPr>
-                <w:rFonts w:ascii="Arial" w:hAnsi="Arial" w:eastAsia="맑은 고딕" w:cs="Arial"/>
-                <w:sz w:val="18"/>
-                <w:szCs w:val="18"/>
-                <w:color w:val="000000"/>
-              </w:rPr>
-              <w:t xml:space="preserve">0.7268</w:t>
-            </w:r>
-          </w:p>
-        </w:tc>
-        <w:tc>
-          <w:tcPr>
-            <w:tcW w:w="1028" w:type="dxa"/>
-            <w:vAlign w:val="center"/>
-          </w:tcPr>
-          <w:p>
-            <w:pPr>
-              <w:widowControl/>
-              <w:snapToGrid w:val="0"/>
-              <w:jc w:val="center"/>
-              <w:spacing w:before="0" w:after="0" w:line="228" w:lineRule="atLeast"/>
-            </w:pPr>
-            <w:r>
-              <w:rPr>
-                <w:rFonts w:ascii="Arial" w:hAnsi="Arial" w:eastAsia="맑은 고딕" w:cs="Arial"/>
-                <w:sz w:val="18"/>
-                <w:szCs w:val="18"/>
-                <w:color w:val="000000"/>
-              </w:rPr>
-              <w:t xml:space="preserve">0.2739</w:t>
-            </w:r>
-          </w:p>
-        </w:tc>
-        <w:tc>
-          <w:tcPr>
-            <w:tcW w:w="914" w:type="dxa"/>
-            <w:vAlign w:val="center"/>
-          </w:tcPr>
-          <w:p>
-            <w:pPr>
-              <w:widowControl/>
-              <w:snapToGrid w:val="0"/>
-              <w:jc w:val="center"/>
-              <w:spacing w:before="0" w:after="0" w:line="228" w:lineRule="atLeast"/>
-            </w:pPr>
-            <w:r>
-              <w:rPr>
-                <w:rFonts w:ascii="Arial" w:hAnsi="Arial" w:eastAsia="맑은 고딕" w:cs="Arial"/>
-                <w:sz w:val="18"/>
-                <w:szCs w:val="18"/>
-                <w:color w:val="000000"/>
-              </w:rPr>
-              <w:t xml:space="preserve">0.9910</w:t>
+            <w:tcW w:w="857" w:type="dxa"/>
+            <w:vAlign w:val="center"/>
+          </w:tcPr>
+          <w:p>
+            <w:pPr>
+              <w:widowControl/>
+              <w:snapToGrid w:val="0"/>
+              <w:jc w:val="center"/>
+              <w:spacing w:before="0" w:after="0" w:line="228" w:lineRule="atLeast"/>
+            </w:pPr>
+            <w:r>
+              <w:rPr>
+                <w:rFonts w:ascii="Arial" w:hAnsi="Arial" w:eastAsia="맑은 고딕" w:cs="Arial"/>
+                <w:sz w:val="18"/>
+                <w:szCs w:val="18"/>
+                <w:color w:val="000000"/>
+              </w:rPr>
+              <w:t xml:space="preserve">XGB</w:t>
+            </w:r>
+          </w:p>
+        </w:tc>
+        <w:tc>
+          <w:tcPr>
+            <w:tcW w:w="1257" w:type="dxa"/>
+            <w:vAlign w:val="center"/>
+          </w:tcPr>
+          <w:p>
+            <w:pPr>
+              <w:widowControl/>
+              <w:snapToGrid w:val="0"/>
+              <w:jc w:val="center"/>
+              <w:spacing w:before="0" w:after="0" w:line="228" w:lineRule="atLeast"/>
+            </w:pPr>
+            <w:r>
+              <w:rPr>
+                <w:rFonts w:ascii="Arial" w:hAnsi="Arial" w:eastAsia="맑은 고딕" w:cs="Arial"/>
+                <w:sz w:val="18"/>
+                <w:szCs w:val="18"/>
+                <w:color w:val="000000"/>
+              </w:rPr>
+              <w:t xml:space="preserve">0.3544</w:t>
+            </w:r>
+          </w:p>
+        </w:tc>
+        <w:tc>
+          <w:tcPr>
+            <w:tcW w:w="1828" w:type="dxa"/>
+            <w:vAlign w:val="center"/>
+          </w:tcPr>
+          <w:p>
+            <w:pPr>
+              <w:widowControl/>
+              <w:snapToGrid w:val="0"/>
+              <w:jc w:val="center"/>
+              <w:spacing w:before="0" w:after="0" w:line="228" w:lineRule="atLeast"/>
+            </w:pPr>
+            <w:r>
+              <w:rPr>
+                <w:rFonts w:ascii="Arial" w:hAnsi="Arial" w:eastAsia="맑은 고딕" w:cs="Arial"/>
+                <w:sz w:val="18"/>
+                <w:szCs w:val="18"/>
+                <w:color w:val="000000"/>
+              </w:rPr>
+              <w:t xml:space="preserve">0.3476–0.3745</w:t>
+            </w:r>
+          </w:p>
+        </w:tc>
+        <w:tc>
+          <w:tcPr>
+            <w:tcW w:w="1086" w:type="dxa"/>
+            <w:vAlign w:val="center"/>
+          </w:tcPr>
+          <w:p>
+            <w:pPr>
+              <w:widowControl/>
+              <w:snapToGrid w:val="0"/>
+              <w:jc w:val="center"/>
+              <w:spacing w:before="0" w:after="0" w:line="228" w:lineRule="atLeast"/>
+            </w:pPr>
+            <w:r>
+              <w:rPr>
+                <w:rFonts w:ascii="Arial" w:hAnsi="Arial" w:eastAsia="맑은 고딕" w:cs="Arial"/>
+                <w:sz w:val="18"/>
+                <w:szCs w:val="18"/>
+                <w:color w:val="000000"/>
+              </w:rPr>
+              <w:t xml:space="preserve">0.3438</w:t>
             </w:r>
           </w:p>
         </w:tc>
@@ -2158,116 +2367,93 @@
         </w:trPr>
         <w:tc>
           <w:tcPr>
-            <w:tcW w:w="1028" w:type="dxa"/>
-            <w:vAlign w:val="center"/>
-          </w:tcPr>
-          <w:p>
-            <w:pPr>
-              <w:widowControl/>
-              <w:snapToGrid w:val="0"/>
-              <w:jc w:val="center"/>
-              <w:spacing w:before="0" w:after="0" w:line="228" w:lineRule="atLeast"/>
-            </w:pPr>
-            <w:r>
-              <w:rPr>
-                <w:rFonts w:ascii="Arial" w:hAnsi="Arial" w:eastAsia="맑은 고딕" w:cs="Arial"/>
-                <w:sz w:val="18"/>
-                <w:szCs w:val="18"/>
-                <w:color w:val="000000"/>
-              </w:rPr>
-              <w:t xml:space="preserve">XGB</w:t>
-            </w:r>
-          </w:p>
-        </w:tc>
-        <w:tc>
-          <w:tcPr>
-            <w:tcW w:w="1028" w:type="dxa"/>
-            <w:vAlign w:val="center"/>
-          </w:tcPr>
-          <w:p>
-            <w:pPr>
-              <w:widowControl/>
-              <w:snapToGrid w:val="0"/>
-              <w:jc w:val="center"/>
-              <w:spacing w:before="0" w:after="0" w:line="228" w:lineRule="atLeast"/>
-            </w:pPr>
-            <w:r>
-              <w:rPr>
-                <w:rFonts w:ascii="Arial" w:hAnsi="Arial" w:eastAsia="맑은 고딕" w:cs="Arial"/>
-                <w:sz w:val="18"/>
-                <w:szCs w:val="18"/>
-                <w:color w:val="000000"/>
-              </w:rPr>
-              <w:t xml:space="preserve">0.3493</w:t>
-            </w:r>
-          </w:p>
-        </w:tc>
-        <w:tc>
-          <w:tcPr>
-            <w:tcW w:w="1028" w:type="dxa"/>
-            <w:vAlign w:val="center"/>
-          </w:tcPr>
-          <w:p>
-            <w:pPr>
-              <w:widowControl/>
-              <w:snapToGrid w:val="0"/>
-              <w:jc w:val="center"/>
-              <w:spacing w:before="0" w:after="0" w:line="228" w:lineRule="atLeast"/>
-            </w:pPr>
-            <w:r>
-              <w:rPr>
-                <w:rFonts w:ascii="Arial" w:hAnsi="Arial" w:eastAsia="맑은 고딕" w:cs="Arial"/>
-                <w:sz w:val="18"/>
-                <w:szCs w:val="18"/>
-                <w:color w:val="000000"/>
-              </w:rPr>
-              <w:t xml:space="preserve">0.7334</w:t>
-            </w:r>
-          </w:p>
-        </w:tc>
-        <w:tc>
-          <w:tcPr>
-            <w:tcW w:w="1028" w:type="dxa"/>
-            <w:vAlign w:val="center"/>
-          </w:tcPr>
-          <w:p>
-            <w:pPr>
-              <w:widowControl/>
-              <w:snapToGrid w:val="0"/>
-              <w:jc w:val="center"/>
-              <w:spacing w:before="0" w:after="0" w:line="228" w:lineRule="atLeast"/>
-            </w:pPr>
-            <w:r>
-              <w:rPr>
-                <w:rFonts w:ascii="Arial" w:hAnsi="Arial" w:eastAsia="맑은 고딕" w:cs="Arial"/>
-                <w:sz w:val="18"/>
-                <w:szCs w:val="18"/>
-                <w:color w:val="000000"/>
-              </w:rPr>
-              <w:t xml:space="preserve">0.2843</w:t>
-            </w:r>
-          </w:p>
-        </w:tc>
-        <w:tc>
-          <w:tcPr>
-            <w:tcW w:w="914" w:type="dxa"/>
-            <w:vAlign w:val="center"/>
-          </w:tcPr>
-          <w:p>
-            <w:pPr>
-              <w:widowControl/>
-              <w:snapToGrid w:val="0"/>
-              <w:jc w:val="center"/>
-              <w:spacing w:before="0" w:after="0" w:line="228" w:lineRule="atLeast"/>
-            </w:pPr>
-            <w:r>
-              <w:rPr>
-                <w:rFonts w:ascii="Arial" w:hAnsi="Arial" w:eastAsia="맑은 고딕" w:cs="Arial"/>
-                <w:sz w:val="18"/>
-                <w:szCs w:val="18"/>
-                <w:color w:val="000000"/>
-              </w:rPr>
-              <w:t xml:space="preserve">0.9842</w:t>
+            <w:tcW w:w="857" w:type="dxa"/>
+            <w:vAlign w:val="center"/>
+          </w:tcPr>
+          <w:p>
+            <w:pPr>
+              <w:widowControl/>
+              <w:snapToGrid w:val="0"/>
+              <w:jc w:val="center"/>
+              <w:spacing w:before="0" w:after="0" w:line="228" w:lineRule="atLeast"/>
+            </w:pPr>
+            <w:r>
+              <w:rPr>
+                <w:rFonts w:ascii="Arial" w:hAnsi="Arial" w:eastAsia="맑은 고딕" w:cs="Arial"/>
+                <w:sz w:val="18"/>
+                <w:szCs w:val="18"/>
+                <w:color w:val="000000"/>
+              </w:rPr>
+              <w:t xml:space="preserve">jMLP</w:t>
+            </w:r>
+          </w:p>
+        </w:tc>
+        <w:tc>
+          <w:tcPr>
+            <w:tcW w:w="1257" w:type="dxa"/>
+            <w:vAlign w:val="center"/>
+          </w:tcPr>
+          <w:p>
+            <w:pPr>
+              <w:widowControl/>
+              <w:snapToGrid w:val="0"/>
+              <w:jc w:val="center"/>
+              <w:spacing w:before="0" w:after="0" w:line="228" w:lineRule="atLeast"/>
+            </w:pPr>
+            <w:r>
+              <w:rPr>
+                <w:rFonts w:ascii="Arial" w:hAnsi="Arial" w:eastAsia="맑은 고딕" w:cs="Arial"/>
+                <w:sz w:val="18"/>
+                <w:szCs w:val="18"/>
+                <w:color w:val="000000"/>
+              </w:rPr>
+              <w:t xml:space="preserve">0.3516</w:t>
+            </w:r>
+          </w:p>
+        </w:tc>
+        <w:tc>
+          <w:tcPr>
+            <w:tcW w:w="1828" w:type="dxa"/>
+            <w:vAlign w:val="center"/>
+          </w:tcPr>
+          <w:p>
+            <w:pPr>
+              <w:widowControl/>
+              <w:snapToGrid w:val="0"/>
+              <w:jc w:val="center"/>
+              <w:spacing w:before="0" w:after="0" w:line="228" w:lineRule="atLeast"/>
+            </w:pPr>
+            <w:r>
+              <w:rPr>
+                <w:rFonts w:ascii="Arial" w:hAnsi="Arial" w:eastAsia="맑은 고딕" w:cs="Arial"/>
+                <w:sz w:val="18"/>
+                <w:szCs w:val="18"/>
+                <w:color w:val="000000"/>
+              </w:rPr>
+              <w:t xml:space="preserve">0.3452–0.3720</w:t>
+            </w:r>
+          </w:p>
+        </w:tc>
+        <w:tc>
+          <w:tcPr>
+            <w:tcW w:w="1086" w:type="dxa"/>
+            <w:vAlign w:val="center"/>
+          </w:tcPr>
+          <w:p>
+            <w:pPr>
+              <w:widowControl/>
+              <w:snapToGrid w:val="0"/>
+              <w:jc w:val="center"/>
+              <w:spacing w:before="0" w:after="0" w:line="228" w:lineRule="atLeast"/>
+            </w:pPr>
+            <w:r>
+              <w:rPr>
+                <w:rFonts w:ascii="Arial" w:hAnsi="Arial" w:eastAsia="맑은 고딕" w:cs="Arial"/>
+                <w:sz w:val="18"/>
+                <w:szCs w:val="18"/>
+                <w:color w:val="000000"/>
+              </w:rPr>
+              <w:t xml:space="preserve">0.3436</w:t>
             </w:r>
           </w:p>
         </w:tc>
@@ -2278,7 +2464,7 @@
         </w:trPr>
         <w:tc>
           <w:tcPr>
-            <w:tcW w:w="1028" w:type="dxa"/>
+            <w:tcW w:w="857" w:type="dxa"/>
             <w:vAlign w:val="center"/>
           </w:tcPr>
           <w:p>
@@ -2301,93 +2487,70 @@
         </w:tc>
         <w:tc>
           <w:tcPr>
-            <w:tcW w:w="1028" w:type="dxa"/>
-            <w:vAlign w:val="center"/>
-          </w:tcPr>
-          <w:p>
-            <w:pPr>
-              <w:widowControl/>
-              <w:snapToGrid w:val="0"/>
-              <w:jc w:val="center"/>
-              <w:spacing w:before="0" w:after="0" w:line="228" w:lineRule="atLeast"/>
-            </w:pPr>
-            <w:r>
-              <w:rPr>
-                <w:rFonts w:ascii="Arial" w:hAnsi="Arial" w:eastAsia="맑은 고딕" w:cs="Arial"/>
-                <w:sz w:val="18"/>
-                <w:szCs w:val="18"/>
-                <w:color w:val="000000"/>
-              </w:rPr>
-              <w:t xml:space="preserve">0.3515</w:t>
-            </w:r>
-          </w:p>
-        </w:tc>
-        <w:tc>
-          <w:tcPr>
-            <w:tcW w:w="1028" w:type="dxa"/>
-            <w:vAlign w:val="center"/>
-          </w:tcPr>
-          <w:p>
-            <w:pPr>
-              <w:widowControl/>
-              <w:snapToGrid w:val="0"/>
-              <w:jc w:val="center"/>
-              <w:spacing w:before="0" w:after="0" w:line="228" w:lineRule="atLeast"/>
-            </w:pPr>
-            <w:r>
-              <w:rPr>
-                <w:rFonts w:ascii="Arial" w:hAnsi="Arial" w:eastAsia="맑은 고딕" w:cs="Arial"/>
-                <w:sz w:val="18"/>
-                <w:szCs w:val="18"/>
-                <w:color w:val="000000"/>
-              </w:rPr>
-              <w:t xml:space="preserve">0.7321</w:t>
-            </w:r>
-          </w:p>
-        </w:tc>
-        <w:tc>
-          <w:tcPr>
-            <w:tcW w:w="1028" w:type="dxa"/>
-            <w:vAlign w:val="center"/>
-          </w:tcPr>
-          <w:p>
-            <w:pPr>
-              <w:widowControl/>
-              <w:snapToGrid w:val="0"/>
-              <w:jc w:val="center"/>
-              <w:spacing w:before="0" w:after="0" w:line="228" w:lineRule="atLeast"/>
-            </w:pPr>
-            <w:r>
-              <w:rPr>
-                <w:rFonts w:ascii="Arial" w:hAnsi="Arial" w:eastAsia="맑은 고딕" w:cs="Arial"/>
-                <w:sz w:val="18"/>
-                <w:szCs w:val="18"/>
-                <w:color w:val="000000"/>
-              </w:rPr>
-              <w:t xml:space="preserve">0.2824</w:t>
-            </w:r>
-          </w:p>
-        </w:tc>
-        <w:tc>
-          <w:tcPr>
-            <w:tcW w:w="914" w:type="dxa"/>
-            <w:vAlign w:val="center"/>
-          </w:tcPr>
-          <w:p>
-            <w:pPr>
-              <w:widowControl/>
-              <w:snapToGrid w:val="0"/>
-              <w:jc w:val="center"/>
-              <w:spacing w:before="0" w:after="0" w:line="228" w:lineRule="atLeast"/>
-            </w:pPr>
-            <w:r>
-              <w:rPr>
-                <w:rFonts w:ascii="Arial" w:hAnsi="Arial" w:eastAsia="맑은 고딕" w:cs="Arial"/>
-                <w:sz w:val="18"/>
-                <w:szCs w:val="18"/>
-                <w:color w:val="000000"/>
-              </w:rPr>
-              <w:t xml:space="preserve">0.9870</w:t>
+            <w:tcW w:w="1257" w:type="dxa"/>
+            <w:vAlign w:val="center"/>
+          </w:tcPr>
+          <w:p>
+            <w:pPr>
+              <w:widowControl/>
+              <w:snapToGrid w:val="0"/>
+              <w:jc w:val="center"/>
+              <w:spacing w:before="0" w:after="0" w:line="228" w:lineRule="atLeast"/>
+            </w:pPr>
+            <w:r>
+              <w:rPr>
+                <w:rFonts w:ascii="Arial" w:hAnsi="Arial" w:eastAsia="맑은 고딕" w:cs="Arial"/>
+                <w:sz w:val="18"/>
+                <w:szCs w:val="18"/>
+                <w:color w:val="000000"/>
+              </w:rPr>
+              <w:t xml:space="preserve">0.3516</w:t>
+            </w:r>
+          </w:p>
+        </w:tc>
+        <w:tc>
+          <w:tcPr>
+            <w:tcW w:w="1828" w:type="dxa"/>
+            <w:vAlign w:val="center"/>
+          </w:tcPr>
+          <w:p>
+            <w:pPr>
+              <w:widowControl/>
+              <w:snapToGrid w:val="0"/>
+              <w:jc w:val="center"/>
+              <w:spacing w:before="0" w:after="0" w:line="228" w:lineRule="atLeast"/>
+            </w:pPr>
+            <w:r>
+              <w:rPr>
+                <w:rFonts w:ascii="Arial" w:hAnsi="Arial" w:eastAsia="맑은 고딕" w:cs="Arial"/>
+                <w:sz w:val="18"/>
+                <w:szCs w:val="18"/>
+                <w:color w:val="000000"/>
+              </w:rPr>
+              <w:t xml:space="preserve">0.3450–0.3725</w:t>
+            </w:r>
+          </w:p>
+        </w:tc>
+        <w:tc>
+          <w:tcPr>
+            <w:tcW w:w="1086" w:type="dxa"/>
+            <w:vAlign w:val="center"/>
+          </w:tcPr>
+          <w:p>
+            <w:pPr>
+              <w:widowControl/>
+              <w:snapToGrid w:val="0"/>
+              <w:jc w:val="center"/>
+              <w:spacing w:before="0" w:after="0" w:line="228" w:lineRule="atLeast"/>
+            </w:pPr>
+            <w:r>
+              <w:rPr>
+                <w:rFonts w:ascii="Arial" w:hAnsi="Arial" w:eastAsia="맑은 고딕" w:cs="Arial"/>
+                <w:sz w:val="18"/>
+                <w:szCs w:val="18"/>
+                <w:color w:val="000000"/>
+              </w:rPr>
+              <w:t xml:space="preserve">0.3406</w:t>
             </w:r>
           </w:p>
         </w:tc>
@@ -2398,7 +2561,7 @@
         </w:trPr>
         <w:tc>
           <w:tcPr>
-            <w:tcW w:w="1028" w:type="dxa"/>
+            <w:tcW w:w="857" w:type="dxa"/>
             <w:vAlign w:val="center"/>
           </w:tcPr>
           <w:p>
@@ -2421,93 +2584,70 @@
         </w:tc>
         <w:tc>
           <w:tcPr>
-            <w:tcW w:w="1028" w:type="dxa"/>
-            <w:vAlign w:val="center"/>
-          </w:tcPr>
-          <w:p>
-            <w:pPr>
-              <w:widowControl/>
-              <w:snapToGrid w:val="0"/>
-              <w:jc w:val="center"/>
-              <w:spacing w:before="0" w:after="0" w:line="228" w:lineRule="atLeast"/>
-            </w:pPr>
-            <w:r>
-              <w:rPr>
-                <w:rFonts w:ascii="Arial" w:hAnsi="Arial" w:eastAsia="맑은 고딕" w:cs="Arial"/>
-                <w:sz w:val="18"/>
-                <w:szCs w:val="18"/>
-                <w:color w:val="000000"/>
-              </w:rPr>
-              <w:t xml:space="preserve">0.3488</w:t>
-            </w:r>
-          </w:p>
-        </w:tc>
-        <w:tc>
-          <w:tcPr>
-            <w:tcW w:w="1028" w:type="dxa"/>
-            <w:vAlign w:val="center"/>
-          </w:tcPr>
-          <w:p>
-            <w:pPr>
-              <w:widowControl/>
-              <w:snapToGrid w:val="0"/>
-              <w:jc w:val="center"/>
-              <w:spacing w:before="0" w:after="0" w:line="228" w:lineRule="atLeast"/>
-            </w:pPr>
-            <w:r>
-              <w:rPr>
-                <w:rFonts w:ascii="Arial" w:hAnsi="Arial" w:eastAsia="맑은 고딕" w:cs="Arial"/>
-                <w:sz w:val="18"/>
-                <w:szCs w:val="18"/>
-                <w:color w:val="000000"/>
-              </w:rPr>
-              <w:t xml:space="preserve">0.7320</w:t>
-            </w:r>
-          </w:p>
-        </w:tc>
-        <w:tc>
-          <w:tcPr>
-            <w:tcW w:w="1028" w:type="dxa"/>
-            <w:vAlign w:val="center"/>
-          </w:tcPr>
-          <w:p>
-            <w:pPr>
-              <w:widowControl/>
-              <w:snapToGrid w:val="0"/>
-              <w:jc w:val="center"/>
-              <w:spacing w:before="0" w:after="0" w:line="228" w:lineRule="atLeast"/>
-            </w:pPr>
-            <w:r>
-              <w:rPr>
-                <w:rFonts w:ascii="Arial" w:hAnsi="Arial" w:eastAsia="맑은 고딕" w:cs="Arial"/>
-                <w:sz w:val="18"/>
-                <w:szCs w:val="18"/>
-                <w:color w:val="000000"/>
-              </w:rPr>
-              <w:t xml:space="preserve">0.2731</w:t>
-            </w:r>
-          </w:p>
-        </w:tc>
-        <w:tc>
-          <w:tcPr>
-            <w:tcW w:w="914" w:type="dxa"/>
-            <w:vAlign w:val="center"/>
-          </w:tcPr>
-          <w:p>
-            <w:pPr>
-              <w:widowControl/>
-              <w:snapToGrid w:val="0"/>
-              <w:jc w:val="center"/>
-              <w:spacing w:before="0" w:after="0" w:line="228" w:lineRule="atLeast"/>
-            </w:pPr>
-            <w:r>
-              <w:rPr>
-                <w:rFonts w:ascii="Arial" w:hAnsi="Arial" w:eastAsia="맑은 고딕" w:cs="Arial"/>
-                <w:sz w:val="18"/>
-                <w:szCs w:val="18"/>
-                <w:color w:val="000000"/>
-              </w:rPr>
-              <w:t xml:space="preserve">0.9881</w:t>
+            <w:tcW w:w="1257" w:type="dxa"/>
+            <w:vAlign w:val="center"/>
+          </w:tcPr>
+          <w:p>
+            <w:pPr>
+              <w:widowControl/>
+              <w:snapToGrid w:val="0"/>
+              <w:jc w:val="center"/>
+              <w:spacing w:before="0" w:after="0" w:line="228" w:lineRule="atLeast"/>
+            </w:pPr>
+            <w:r>
+              <w:rPr>
+                <w:rFonts w:ascii="Arial" w:hAnsi="Arial" w:eastAsia="맑은 고딕" w:cs="Arial"/>
+                <w:sz w:val="18"/>
+                <w:szCs w:val="18"/>
+                <w:color w:val="000000"/>
+              </w:rPr>
+              <w:t xml:space="preserve">0.3509</w:t>
+            </w:r>
+          </w:p>
+        </w:tc>
+        <w:tc>
+          <w:tcPr>
+            <w:tcW w:w="1828" w:type="dxa"/>
+            <w:vAlign w:val="center"/>
+          </w:tcPr>
+          <w:p>
+            <w:pPr>
+              <w:widowControl/>
+              <w:snapToGrid w:val="0"/>
+              <w:jc w:val="center"/>
+              <w:spacing w:before="0" w:after="0" w:line="228" w:lineRule="atLeast"/>
+            </w:pPr>
+            <w:r>
+              <w:rPr>
+                <w:rFonts w:ascii="Arial" w:hAnsi="Arial" w:eastAsia="맑은 고딕" w:cs="Arial"/>
+                <w:sz w:val="18"/>
+                <w:szCs w:val="18"/>
+                <w:color w:val="000000"/>
+              </w:rPr>
+              <w:t xml:space="preserve">0.3440–0.3701</w:t>
+            </w:r>
+          </w:p>
+        </w:tc>
+        <w:tc>
+          <w:tcPr>
+            <w:tcW w:w="1086" w:type="dxa"/>
+            <w:vAlign w:val="center"/>
+          </w:tcPr>
+          <w:p>
+            <w:pPr>
+              <w:widowControl/>
+              <w:snapToGrid w:val="0"/>
+              <w:jc w:val="center"/>
+              <w:spacing w:before="0" w:after="0" w:line="228" w:lineRule="atLeast"/>
+            </w:pPr>
+            <w:r>
+              <w:rPr>
+                <w:rFonts w:ascii="Arial" w:hAnsi="Arial" w:eastAsia="맑은 고딕" w:cs="Arial"/>
+                <w:sz w:val="18"/>
+                <w:szCs w:val="18"/>
+                <w:color w:val="000000"/>
+              </w:rPr>
+              <w:t xml:space="preserve">0.3395</w:t>
             </w:r>
           </w:p>
         </w:tc>
@@ -2518,116 +2658,93 @@
         </w:trPr>
         <w:tc>
           <w:tcPr>
-            <w:tcW w:w="1028" w:type="dxa"/>
-            <w:vAlign w:val="center"/>
-          </w:tcPr>
-          <w:p>
-            <w:pPr>
-              <w:widowControl/>
-              <w:snapToGrid w:val="0"/>
-              <w:jc w:val="center"/>
-              <w:spacing w:before="0" w:after="0" w:line="228" w:lineRule="atLeast"/>
-            </w:pPr>
-            <w:r>
-              <w:rPr>
-                <w:rFonts w:ascii="Arial" w:hAnsi="Arial" w:eastAsia="맑은 고딕" w:cs="Arial"/>
-                <w:sz w:val="18"/>
-                <w:szCs w:val="18"/>
-                <w:color w:val="000000"/>
-              </w:rPr>
-              <w:t xml:space="preserve">jLinear</w:t>
-            </w:r>
-          </w:p>
-        </w:tc>
-        <w:tc>
-          <w:tcPr>
-            <w:tcW w:w="1028" w:type="dxa"/>
-            <w:vAlign w:val="center"/>
-          </w:tcPr>
-          <w:p>
-            <w:pPr>
-              <w:widowControl/>
-              <w:snapToGrid w:val="0"/>
-              <w:jc w:val="center"/>
-              <w:spacing w:before="0" w:after="0" w:line="228" w:lineRule="atLeast"/>
-            </w:pPr>
-            <w:r>
-              <w:rPr>
-                <w:rFonts w:ascii="Arial" w:hAnsi="Arial" w:eastAsia="맑은 고딕" w:cs="Arial"/>
-                <w:sz w:val="18"/>
-                <w:szCs w:val="18"/>
-                <w:color w:val="000000"/>
-              </w:rPr>
-              <w:t xml:space="preserve">0.3444</w:t>
-            </w:r>
-          </w:p>
-        </w:tc>
-        <w:tc>
-          <w:tcPr>
-            <w:tcW w:w="1028" w:type="dxa"/>
-            <w:vAlign w:val="center"/>
-          </w:tcPr>
-          <w:p>
-            <w:pPr>
-              <w:widowControl/>
-              <w:snapToGrid w:val="0"/>
-              <w:jc w:val="center"/>
-              <w:spacing w:before="0" w:after="0" w:line="228" w:lineRule="atLeast"/>
-            </w:pPr>
-            <w:r>
-              <w:rPr>
-                <w:rFonts w:ascii="Arial" w:hAnsi="Arial" w:eastAsia="맑은 고딕" w:cs="Arial"/>
-                <w:sz w:val="18"/>
-                <w:szCs w:val="18"/>
-                <w:color w:val="000000"/>
-              </w:rPr>
-              <w:t xml:space="preserve">0.7372</w:t>
-            </w:r>
-          </w:p>
-        </w:tc>
-        <w:tc>
-          <w:tcPr>
-            <w:tcW w:w="1028" w:type="dxa"/>
-            <w:vAlign w:val="center"/>
-          </w:tcPr>
-          <w:p>
-            <w:pPr>
-              <w:widowControl/>
-              <w:snapToGrid w:val="0"/>
-              <w:jc w:val="center"/>
-              <w:spacing w:before="0" w:after="0" w:line="228" w:lineRule="atLeast"/>
-            </w:pPr>
-            <w:r>
-              <w:rPr>
-                <w:rFonts w:ascii="Arial" w:hAnsi="Arial" w:eastAsia="맑은 고딕" w:cs="Arial"/>
-                <w:sz w:val="18"/>
-                <w:szCs w:val="18"/>
-                <w:color w:val="000000"/>
-              </w:rPr>
-              <w:t xml:space="preserve">0.2607</w:t>
-            </w:r>
-          </w:p>
-        </w:tc>
-        <w:tc>
-          <w:tcPr>
-            <w:tcW w:w="914" w:type="dxa"/>
-            <w:vAlign w:val="center"/>
-          </w:tcPr>
-          <w:p>
-            <w:pPr>
-              <w:widowControl/>
-              <w:snapToGrid w:val="0"/>
-              <w:jc w:val="center"/>
-              <w:spacing w:before="0" w:after="0" w:line="228" w:lineRule="atLeast"/>
-            </w:pPr>
-            <w:r>
-              <w:rPr>
-                <w:rFonts w:ascii="Arial" w:hAnsi="Arial" w:eastAsia="맑은 고딕" w:cs="Arial"/>
-                <w:sz w:val="18"/>
-                <w:szCs w:val="18"/>
-                <w:color w:val="000000"/>
-              </w:rPr>
-              <w:t xml:space="preserve">0.9885</w:t>
+            <w:tcW w:w="857" w:type="dxa"/>
+            <w:vAlign w:val="center"/>
+          </w:tcPr>
+          <w:p>
+            <w:pPr>
+              <w:widowControl/>
+              <w:snapToGrid w:val="0"/>
+              <w:jc w:val="center"/>
+              <w:spacing w:before="0" w:after="0" w:line="228" w:lineRule="atLeast"/>
+            </w:pPr>
+            <w:r>
+              <w:rPr>
+                <w:rFonts w:ascii="Arial" w:hAnsi="Arial" w:eastAsia="맑은 고딕" w:cs="Arial"/>
+                <w:sz w:val="18"/>
+                <w:szCs w:val="18"/>
+                <w:color w:val="000000"/>
+              </w:rPr>
+              <w:t xml:space="preserve">LR</w:t>
+            </w:r>
+          </w:p>
+        </w:tc>
+        <w:tc>
+          <w:tcPr>
+            <w:tcW w:w="1257" w:type="dxa"/>
+            <w:vAlign w:val="center"/>
+          </w:tcPr>
+          <w:p>
+            <w:pPr>
+              <w:widowControl/>
+              <w:snapToGrid w:val="0"/>
+              <w:jc w:val="center"/>
+              <w:spacing w:before="0" w:after="0" w:line="228" w:lineRule="atLeast"/>
+            </w:pPr>
+            <w:r>
+              <w:rPr>
+                <w:rFonts w:ascii="Arial" w:hAnsi="Arial" w:eastAsia="맑은 고딕" w:cs="Arial"/>
+                <w:sz w:val="18"/>
+                <w:szCs w:val="18"/>
+                <w:color w:val="000000"/>
+              </w:rPr>
+              <w:t xml:space="preserve">0.3503</w:t>
+            </w:r>
+          </w:p>
+        </w:tc>
+        <w:tc>
+          <w:tcPr>
+            <w:tcW w:w="1828" w:type="dxa"/>
+            <w:vAlign w:val="center"/>
+          </w:tcPr>
+          <w:p>
+            <w:pPr>
+              <w:widowControl/>
+              <w:snapToGrid w:val="0"/>
+              <w:jc w:val="center"/>
+              <w:spacing w:before="0" w:after="0" w:line="228" w:lineRule="atLeast"/>
+            </w:pPr>
+            <w:r>
+              <w:rPr>
+                <w:rFonts w:ascii="Arial" w:hAnsi="Arial" w:eastAsia="맑은 고딕" w:cs="Arial"/>
+                <w:sz w:val="18"/>
+                <w:szCs w:val="18"/>
+                <w:color w:val="000000"/>
+              </w:rPr>
+              <w:t xml:space="preserve">0.3448–0.3712</w:t>
+            </w:r>
+          </w:p>
+        </w:tc>
+        <w:tc>
+          <w:tcPr>
+            <w:tcW w:w="1086" w:type="dxa"/>
+            <w:vAlign w:val="center"/>
+          </w:tcPr>
+          <w:p>
+            <w:pPr>
+              <w:widowControl/>
+              <w:snapToGrid w:val="0"/>
+              <w:jc w:val="center"/>
+              <w:spacing w:before="0" w:after="0" w:line="228" w:lineRule="atLeast"/>
+            </w:pPr>
+            <w:r>
+              <w:rPr>
+                <w:rFonts w:ascii="Arial" w:hAnsi="Arial" w:eastAsia="맑은 고딕" w:cs="Arial"/>
+                <w:sz w:val="18"/>
+                <w:szCs w:val="18"/>
+                <w:color w:val="000000"/>
+              </w:rPr>
+              <w:t xml:space="preserve">0.3358</w:t>
             </w:r>
           </w:p>
         </w:tc>
@@ -2638,30 +2755,30 @@
         </w:trPr>
         <w:tc>
           <w:tcPr>
-            <w:tcW w:w="1028" w:type="dxa"/>
-            <w:vAlign w:val="center"/>
-          </w:tcPr>
-          <w:p>
-            <w:pPr>
-              <w:widowControl/>
-              <w:snapToGrid w:val="0"/>
-              <w:jc w:val="center"/>
-              <w:spacing w:before="0" w:after="0" w:line="228" w:lineRule="atLeast"/>
-            </w:pPr>
-            <w:r>
-              <w:rPr>
-                <w:rFonts w:ascii="Arial" w:hAnsi="Arial" w:eastAsia="맑은 고딕" w:cs="Arial"/>
-                <w:sz w:val="18"/>
-                <w:szCs w:val="18"/>
-                <w:color w:val="000000"/>
-              </w:rPr>
-              <w:t xml:space="preserve">jMLP</w:t>
-            </w:r>
-          </w:p>
-        </w:tc>
-        <w:tc>
-          <w:tcPr>
-            <w:tcW w:w="1028" w:type="dxa"/>
+            <w:tcW w:w="857" w:type="dxa"/>
+            <w:vAlign w:val="center"/>
+          </w:tcPr>
+          <w:p>
+            <w:pPr>
+              <w:widowControl/>
+              <w:snapToGrid w:val="0"/>
+              <w:jc w:val="center"/>
+              <w:spacing w:before="0" w:after="0" w:line="228" w:lineRule="atLeast"/>
+            </w:pPr>
+            <w:r>
+              <w:rPr>
+                <w:rFonts w:ascii="Arial" w:hAnsi="Arial" w:eastAsia="맑은 고딕" w:cs="Arial"/>
+                <w:sz w:val="18"/>
+                <w:szCs w:val="18"/>
+                <w:color w:val="000000"/>
+              </w:rPr>
+              <w:t xml:space="preserve">jLinear</w:t>
+            </w:r>
+          </w:p>
+        </w:tc>
+        <w:tc>
+          <w:tcPr>
+            <w:tcW w:w="1257" w:type="dxa"/>
             <w:vAlign w:val="center"/>
           </w:tcPr>
           <w:p>
@@ -2684,70 +2801,47 @@
         </w:tc>
         <w:tc>
           <w:tcPr>
-            <w:tcW w:w="1028" w:type="dxa"/>
-            <w:vAlign w:val="center"/>
-          </w:tcPr>
-          <w:p>
-            <w:pPr>
-              <w:widowControl/>
-              <w:snapToGrid w:val="0"/>
-              <w:jc w:val="center"/>
-              <w:spacing w:before="0" w:after="0" w:line="228" w:lineRule="atLeast"/>
-            </w:pPr>
-            <w:r>
-              <w:rPr>
-                <w:rFonts w:ascii="Arial" w:hAnsi="Arial" w:eastAsia="맑은 고딕" w:cs="Arial"/>
-                <w:sz w:val="18"/>
-                <w:szCs w:val="18"/>
-                <w:color w:val="000000"/>
-              </w:rPr>
-              <w:t xml:space="preserve">0.7357</w:t>
-            </w:r>
-          </w:p>
-        </w:tc>
-        <w:tc>
-          <w:tcPr>
-            <w:tcW w:w="1028" w:type="dxa"/>
-            <w:vAlign w:val="center"/>
-          </w:tcPr>
-          <w:p>
-            <w:pPr>
-              <w:widowControl/>
-              <w:snapToGrid w:val="0"/>
-              <w:jc w:val="center"/>
-              <w:spacing w:before="0" w:after="0" w:line="228" w:lineRule="atLeast"/>
-            </w:pPr>
-            <w:r>
-              <w:rPr>
-                <w:rFonts w:ascii="Arial" w:hAnsi="Arial" w:eastAsia="맑은 고딕" w:cs="Arial"/>
-                <w:sz w:val="18"/>
-                <w:szCs w:val="18"/>
-                <w:color w:val="000000"/>
-              </w:rPr>
-              <w:t xml:space="preserve">0.2746</w:t>
-            </w:r>
-          </w:p>
-        </w:tc>
-        <w:tc>
-          <w:tcPr>
-            <w:tcW w:w="914" w:type="dxa"/>
-            <w:vAlign w:val="center"/>
-          </w:tcPr>
-          <w:p>
-            <w:pPr>
-              <w:widowControl/>
-              <w:snapToGrid w:val="0"/>
-              <w:jc w:val="center"/>
-              <w:spacing w:before="0" w:after="0" w:line="228" w:lineRule="atLeast"/>
-            </w:pPr>
-            <w:r>
-              <w:rPr>
-                <w:rFonts w:ascii="Arial" w:hAnsi="Arial" w:eastAsia="맑은 고딕" w:cs="Arial"/>
-                <w:sz w:val="18"/>
-                <w:szCs w:val="18"/>
-                <w:color w:val="000000"/>
-              </w:rPr>
-              <w:t xml:space="preserve">0.9850</w:t>
+            <w:tcW w:w="1828" w:type="dxa"/>
+            <w:vAlign w:val="center"/>
+          </w:tcPr>
+          <w:p>
+            <w:pPr>
+              <w:widowControl/>
+              <w:snapToGrid w:val="0"/>
+              <w:jc w:val="center"/>
+              <w:spacing w:before="0" w:after="0" w:line="228" w:lineRule="atLeast"/>
+            </w:pPr>
+            <w:r>
+              <w:rPr>
+                <w:rFonts w:ascii="Arial" w:hAnsi="Arial" w:eastAsia="맑은 고딕" w:cs="Arial"/>
+                <w:sz w:val="18"/>
+                <w:szCs w:val="18"/>
+                <w:color w:val="000000"/>
+              </w:rPr>
+              <w:t xml:space="preserve">0.3432–0.3685</w:t>
+            </w:r>
+          </w:p>
+        </w:tc>
+        <w:tc>
+          <w:tcPr>
+            <w:tcW w:w="1086" w:type="dxa"/>
+            <w:vAlign w:val="center"/>
+          </w:tcPr>
+          <w:p>
+            <w:pPr>
+              <w:widowControl/>
+              <w:snapToGrid w:val="0"/>
+              <w:jc w:val="center"/>
+              <w:spacing w:before="0" w:after="0" w:line="228" w:lineRule="atLeast"/>
+            </w:pPr>
+            <w:r>
+              <w:rPr>
+                <w:rFonts w:ascii="Arial" w:hAnsi="Arial" w:eastAsia="맑은 고딕" w:cs="Arial"/>
+                <w:sz w:val="18"/>
+                <w:szCs w:val="18"/>
+                <w:color w:val="000000"/>
+              </w:rPr>
+              <w:t xml:space="preserve">0.3417</w:t>
             </w:r>
           </w:p>
         </w:tc>
@@ -2758,121 +2852,115 @@
         </w:trPr>
         <w:tc>
           <w:tcPr>
-            <w:tcW w:w="1028" w:type="dxa"/>
-            <w:vAlign w:val="center"/>
-          </w:tcPr>
-          <w:p>
-            <w:pPr>
-              <w:widowControl/>
-              <w:snapToGrid w:val="0"/>
-              <w:jc w:val="center"/>
-              <w:spacing w:before="0" w:after="0" w:line="228" w:lineRule="atLeast"/>
-            </w:pPr>
-            <w:r>
-              <w:rPr>
-                <w:rFonts w:ascii="Arial" w:hAnsi="Arial" w:eastAsia="맑은 고딕" w:cs="Arial"/>
-                <w:sz w:val="18"/>
-                <w:szCs w:val="18"/>
-                <w:color w:val="000000"/>
-              </w:rPr>
-              <w:t xml:space="preserve">jEPF</w:t>
-            </w:r>
-          </w:p>
-        </w:tc>
-        <w:tc>
-          <w:tcPr>
-            <w:tcW w:w="1028" w:type="dxa"/>
-            <w:vAlign w:val="center"/>
-          </w:tcPr>
-          <w:p>
-            <w:pPr>
-              <w:widowControl/>
-              <w:snapToGrid w:val="0"/>
-              <w:jc w:val="center"/>
-              <w:spacing w:before="0" w:after="0" w:line="228" w:lineRule="atLeast"/>
-            </w:pPr>
-            <w:r>
-              <w:rPr>
-                <w:rFonts w:ascii="Arial" w:hAnsi="Arial" w:eastAsia="맑은 고딕" w:cs="Arial"/>
-                <w:sz w:val="18"/>
-                <w:szCs w:val="18"/>
-                <w:color w:val="000000"/>
-              </w:rPr>
-              <w:t xml:space="preserve">0.3515</w:t>
-            </w:r>
-          </w:p>
-        </w:tc>
-        <w:tc>
-          <w:tcPr>
-            <w:tcW w:w="1028" w:type="dxa"/>
-            <w:vAlign w:val="center"/>
-          </w:tcPr>
-          <w:p>
-            <w:pPr>
-              <w:widowControl/>
-              <w:snapToGrid w:val="0"/>
-              <w:jc w:val="center"/>
-              <w:spacing w:before="0" w:after="0" w:line="228" w:lineRule="atLeast"/>
-            </w:pPr>
-            <w:r>
-              <w:rPr>
-                <w:rFonts w:ascii="Arial" w:hAnsi="Arial" w:eastAsia="맑은 고딕" w:cs="Arial"/>
-                <w:sz w:val="18"/>
-                <w:szCs w:val="18"/>
-                <w:color w:val="000000"/>
-              </w:rPr>
-              <w:t xml:space="preserve">0.7354</w:t>
-            </w:r>
-          </w:p>
-        </w:tc>
-        <w:tc>
-          <w:tcPr>
-            <w:tcW w:w="1028" w:type="dxa"/>
-            <w:vAlign w:val="center"/>
-          </w:tcPr>
-          <w:p>
-            <w:pPr>
-              <w:widowControl/>
-              <w:snapToGrid w:val="0"/>
-              <w:jc w:val="center"/>
-              <w:spacing w:before="0" w:after="0" w:line="228" w:lineRule="atLeast"/>
-            </w:pPr>
-            <w:r>
-              <w:rPr>
-                <w:rFonts w:ascii="Arial" w:hAnsi="Arial" w:eastAsia="맑은 고딕" w:cs="Arial"/>
-                <w:sz w:val="18"/>
-                <w:szCs w:val="18"/>
-                <w:color w:val="000000"/>
-              </w:rPr>
-              <w:t xml:space="preserve">0.2829</w:t>
-            </w:r>
-          </w:p>
-        </w:tc>
-        <w:tc>
-          <w:tcPr>
-            <w:tcW w:w="914" w:type="dxa"/>
-            <w:vAlign w:val="center"/>
-          </w:tcPr>
-          <w:p>
-            <w:pPr>
-              <w:widowControl/>
-              <w:snapToGrid w:val="0"/>
-              <w:jc w:val="center"/>
-              <w:spacing w:before="0" w:after="0" w:line="228" w:lineRule="atLeast"/>
-            </w:pPr>
-            <w:r>
-              <w:rPr>
-                <w:rFonts w:ascii="Arial" w:hAnsi="Arial" w:eastAsia="맑은 고딕" w:cs="Arial"/>
-                <w:sz w:val="18"/>
-                <w:szCs w:val="18"/>
-                <w:color w:val="000000"/>
-              </w:rPr>
-              <w:t xml:space="preserve">0.9857</w:t>
+            <w:tcW w:w="857" w:type="dxa"/>
+            <w:vAlign w:val="center"/>
+          </w:tcPr>
+          <w:p>
+            <w:pPr>
+              <w:widowControl/>
+              <w:snapToGrid w:val="0"/>
+              <w:jc w:val="center"/>
+              <w:spacing w:before="0" w:after="0" w:line="228" w:lineRule="atLeast"/>
+            </w:pPr>
+            <w:r>
+              <w:rPr>
+                <w:rFonts w:ascii="Arial" w:hAnsi="Arial" w:eastAsia="맑은 고딕" w:cs="Arial"/>
+                <w:sz w:val="18"/>
+                <w:szCs w:val="18"/>
+                <w:color w:val="000000"/>
+              </w:rPr>
+              <w:t xml:space="preserve">RF</w:t>
+            </w:r>
+          </w:p>
+        </w:tc>
+        <w:tc>
+          <w:tcPr>
+            <w:tcW w:w="1257" w:type="dxa"/>
+            <w:vAlign w:val="center"/>
+          </w:tcPr>
+          <w:p>
+            <w:pPr>
+              <w:widowControl/>
+              <w:snapToGrid w:val="0"/>
+              <w:jc w:val="center"/>
+              <w:spacing w:before="0" w:after="0" w:line="228" w:lineRule="atLeast"/>
+            </w:pPr>
+            <w:r>
+              <w:rPr>
+                <w:rFonts w:ascii="Arial" w:hAnsi="Arial" w:eastAsia="맑은 고딕" w:cs="Arial"/>
+                <w:sz w:val="18"/>
+                <w:szCs w:val="18"/>
+                <w:color w:val="000000"/>
+              </w:rPr>
+              <w:t xml:space="preserve">0.3470</w:t>
+            </w:r>
+          </w:p>
+        </w:tc>
+        <w:tc>
+          <w:tcPr>
+            <w:tcW w:w="1828" w:type="dxa"/>
+            <w:vAlign w:val="center"/>
+          </w:tcPr>
+          <w:p>
+            <w:pPr>
+              <w:widowControl/>
+              <w:snapToGrid w:val="0"/>
+              <w:jc w:val="center"/>
+              <w:spacing w:before="0" w:after="0" w:line="228" w:lineRule="atLeast"/>
+            </w:pPr>
+            <w:r>
+              <w:rPr>
+                <w:rFonts w:ascii="Arial" w:hAnsi="Arial" w:eastAsia="맑은 고딕" w:cs="Arial"/>
+                <w:sz w:val="18"/>
+                <w:szCs w:val="18"/>
+                <w:color w:val="000000"/>
+              </w:rPr>
+              <w:t xml:space="preserve">0.3419–0.3671</w:t>
+            </w:r>
+          </w:p>
+        </w:tc>
+        <w:tc>
+          <w:tcPr>
+            <w:tcW w:w="1086" w:type="dxa"/>
+            <w:vAlign w:val="center"/>
+          </w:tcPr>
+          <w:p>
+            <w:pPr>
+              <w:widowControl/>
+              <w:snapToGrid w:val="0"/>
+              <w:jc w:val="center"/>
+              <w:spacing w:before="0" w:after="0" w:line="228" w:lineRule="atLeast"/>
+            </w:pPr>
+            <w:r>
+              <w:rPr>
+                <w:rFonts w:ascii="Arial" w:hAnsi="Arial" w:eastAsia="맑은 고딕" w:cs="Arial"/>
+                <w:sz w:val="18"/>
+                <w:szCs w:val="18"/>
+                <w:color w:val="000000"/>
+              </w:rPr>
+              <w:t xml:space="preserve">0.3347</w:t>
             </w:r>
           </w:p>
         </w:tc>
       </w:tr>
     </w:tbl>
+    <w:p>
+      <w:pPr>
+        <w:widowControl/>
+        <w:snapToGrid w:val="0"/>
+        <w:jc w:val="both"/>
+        <w:spacing w:before="0" w:after="0" w:line="20" w:lineRule="exact"/>
+      </w:pPr>
+      <w:r>
+        <w:rPr>
+          <w:rFonts w:ascii="Arial" w:hAnsi="Arial" w:eastAsia="맑은 고딕" w:cs="Arial"/>
+          <w:sz w:val="19"/>
+          <w:szCs w:val="19"/>
+          <w:color w:val="000000"/>
+        </w:rPr>
+        <w:t xml:space="preserve"/>
+      </w:r>
+    </w:p>
     <w:sectPr>
       <w:type w:val="continuous"/>
       <w:pgSz w:w="11906" w:h="16838" w:code="9"/>

</xml_diff>